<commit_message>
paper: move Related work to §2 (right after Introduction); rebuild DOCX
Renumber all headings/cross-refs in one pass; disambiguate §2.4 'Benchmark
datasets' from §5.1 'Datasets'. DOCX rebuilt: 48 OMML equations, figure, 3 tables.

Co-Authored-By: Claude Opus 4.8 <noreply@anthropic.com>
</commit_message>
<xml_diff>
--- a/poc/paper/paper.docx
+++ b/poc/paper/paper.docx
@@ -340,37 +340,37 @@
         <w:t xml:space="preserve"> </w:t>
       </w:r>
       <w:r>
-        <w:t xml:space="preserve">2 The MIIM assumptions about CPS normal data ·</w:t>
-      </w:r>
-      <w:r>
-        <w:t xml:space="preserve"> </w:t>
-      </w:r>
-      <w:r>
-        <w:t xml:space="preserve">3 Method ·</w:t>
-      </w:r>
-      <w:r>
-        <w:t xml:space="preserve"> </w:t>
-      </w:r>
-      <w:r>
-        <w:t xml:space="preserve">4 Experimental methodology ·</w:t>
-      </w:r>
-      <w:r>
-        <w:t xml:space="preserve"> </w:t>
-      </w:r>
-      <w:r>
-        <w:t xml:space="preserve">5 Results ·</w:t>
-      </w:r>
-      <w:r>
-        <w:t xml:space="preserve"> </w:t>
-      </w:r>
-      <w:r>
-        <w:t xml:space="preserve">6 Discussion ·</w:t>
-      </w:r>
-      <w:r>
-        <w:t xml:space="preserve"> </w:t>
-      </w:r>
-      <w:r>
-        <w:t xml:space="preserve">7 Related work ·</w:t>
+        <w:t xml:space="preserve">2 Related work ·</w:t>
+      </w:r>
+      <w:r>
+        <w:t xml:space="preserve"> </w:t>
+      </w:r>
+      <w:r>
+        <w:t xml:space="preserve">3 The MIIM assumptions about CPS normal data ·</w:t>
+      </w:r>
+      <w:r>
+        <w:t xml:space="preserve"> </w:t>
+      </w:r>
+      <w:r>
+        <w:t xml:space="preserve">4 Method ·</w:t>
+      </w:r>
+      <w:r>
+        <w:t xml:space="preserve"> </w:t>
+      </w:r>
+      <w:r>
+        <w:t xml:space="preserve">5 Experimental methodology ·</w:t>
+      </w:r>
+      <w:r>
+        <w:t xml:space="preserve"> </w:t>
+      </w:r>
+      <w:r>
+        <w:t xml:space="preserve">6 Results ·</w:t>
+      </w:r>
+      <w:r>
+        <w:t xml:space="preserve"> </w:t>
+      </w:r>
+      <w:r>
+        <w:t xml:space="preserve">7 Discussion ·</w:t>
       </w:r>
       <w:r>
         <w:t xml:space="preserve"> </w:t>
@@ -642,7 +642,7 @@
         <w:t xml:space="preserve"> </w:t>
       </w:r>
       <w:r>
-        <w:t xml:space="preserve">(§2).</w:t>
+        <w:t xml:space="preserve">(§3).</w:t>
       </w:r>
       <w:r>
         <w:t xml:space="preserve"> </w:t>
@@ -682,7 +682,7 @@
         <w:t xml:space="preserve"> </w:t>
       </w:r>
       <w:r>
-        <w:t xml:space="preserve">(§3).</w:t>
+        <w:t xml:space="preserve">(§4).</w:t>
       </w:r>
       <w:r>
         <w:t xml:space="preserve"> </w:t>
@@ -716,7 +716,7 @@
         <w:t xml:space="preserve"> </w:t>
       </w:r>
       <w:r>
-        <w:t xml:space="preserve">TranAD and GDN, re-computed with the same raw metrics (§4–5). The detector wins the combined</w:t>
+        <w:t xml:space="preserve">TranAD and GDN, re-computed with the same raw metrics (§5–6). The detector wins the combined</w:t>
       </w:r>
       <w:r>
         <w:t xml:space="preserve"> </w:t>
@@ -746,7 +746,7 @@
         <w:t xml:space="preserve"> </w:t>
       </w:r>
       <w:r>
-        <w:t xml:space="preserve">per dataset; several results are single-seed and the best-F1 threshold is an oracle (disclosed in §4). We</w:t>
+        <w:t xml:space="preserve">per dataset; several results are single-seed and the best-F1 threshold is an oracle (disclosed in §5). We</w:t>
       </w:r>
       <w:r>
         <w:t xml:space="preserve"> </w:t>
@@ -756,7 +756,7 @@
       </w:r>
     </w:p>
     <w:bookmarkEnd w:id="10"/>
-    <w:bookmarkStart w:id="11" w:name="Xfdcce8d466a3f0d09792019706ab8acf076f115"/>
+    <w:bookmarkStart w:id="15" w:name="related-work"/>
     <w:p>
       <w:pPr>
         <w:pStyle w:val="Heading2"/>
@@ -765,7 +765,684 @@
         <w:widowControl w:val="1"/>
       </w:pPr>
       <w:r>
-        <w:t xml:space="preserve">2  The MIIM assumptions about CPS normal data</w:t>
+        <w:t xml:space="preserve">2  Related work</w:t>
+      </w:r>
+    </w:p>
+    <w:p>
+      <w:pPr>
+        <w:pStyle w:val="FirstParagraph"/>
+        <w:jc w:val="both"/>
+        <w:keepNext w:val="0"/>
+        <w:keepLines w:val="0"/>
+        <w:widowControl w:val="1"/>
+      </w:pPr>
+      <w:r>
+        <w:t xml:space="preserve">Anomaly detection is the unsupervised or semi-supervised task of flagging departures from a model of normal behaviour, adopted precisely because labelled anomalies are too scarce to train a classifier [</w:t>
+      </w:r>
+      <w:hyperlink w:anchor="r-chandola">
+        <w:r>
+          <w:rPr>
+            <w:rStyle w:val="Hyperlink"/>
+          </w:rPr>
+          <w:t xml:space="preserve">22</w:t>
+        </w:r>
+      </w:hyperlink>
+      <w:r>
+        <w:t xml:space="preserve">, </w:t>
+      </w:r>
+      <w:hyperlink w:anchor="r-pang">
+        <w:r>
+          <w:rPr>
+            <w:rStyle w:val="Hyperlink"/>
+          </w:rPr>
+          <w:t xml:space="preserve">23</w:t>
+        </w:r>
+      </w:hyperlink>
+      <w:r>
+        <w:t xml:space="preserve">, </w:t>
+      </w:r>
+      <w:hyperlink w:anchor="r-ruff">
+        <w:r>
+          <w:rPr>
+            <w:rStyle w:val="Hyperlink"/>
+          </w:rPr>
+          <w:t xml:space="preserve">24</w:t>
+        </w:r>
+      </w:hyperlink>
+      <w:r>
+        <w:t xml:space="preserve">]. On time series it must additionally respect temporal and cross-channel dependence [</w:t>
+      </w:r>
+      <w:hyperlink w:anchor="r-tsreview">
+        <w:r>
+          <w:rPr>
+            <w:rStyle w:val="Hyperlink"/>
+          </w:rPr>
+          <w:t xml:space="preserve">25</w:t>
+        </w:r>
+      </w:hyperlink>
+      <w:r>
+        <w:t xml:space="preserve">], and on cyber-physical and industrial control systems it underpins physics-aware intrusion and fault detection [</w:t>
+      </w:r>
+      <w:hyperlink w:anchor="r-icssurvey">
+        <w:r>
+          <w:rPr>
+            <w:rStyle w:val="Hyperlink"/>
+          </w:rPr>
+          <w:t xml:space="preserve">26</w:t>
+        </w:r>
+      </w:hyperlink>
+      <w:r>
+        <w:t xml:space="preserve">]. LatAD sits squarely in this line: unsupervised, trained on normal only, and specialised to the multimodal structure of cyber-physical normal behaviour.</w:t>
+      </w:r>
+    </w:p>
+    <w:bookmarkStart w:id="11" w:name="Xd79ac398892bc84acd5a01a98e1c3327df498f0"/>
+    <w:p>
+      <w:pPr>
+        <w:pStyle w:val="Heading3"/>
+        <w:keepNext/>
+        <w:keepLines/>
+        <w:widowControl w:val="1"/>
+      </w:pPr>
+      <w:r>
+        <w:t xml:space="preserve">2.1  The illusion of progress in time-series anomaly-detection evaluation</w:t>
+      </w:r>
+    </w:p>
+    <w:p>
+      <w:pPr>
+        <w:pStyle w:val="FirstParagraph"/>
+        <w:jc w:val="both"/>
+        <w:keepNext w:val="0"/>
+        <w:keepLines w:val="0"/>
+        <w:widowControl w:val="1"/>
+      </w:pPr>
+      <w:r>
+        <w:t xml:space="preserve">A line of critical work shows that the standard evaluation of time-series anomaly detection is unreliable.</w:t>
+      </w:r>
+      <w:r>
+        <w:t xml:space="preserve"> </w:t>
+      </w:r>
+      <w:r>
+        <w:t xml:space="preserve">Kim et al. [</w:t>
+      </w:r>
+      <w:hyperlink w:anchor="r-kim">
+        <w:r>
+          <w:rPr>
+            <w:rStyle w:val="Hyperlink"/>
+          </w:rPr>
+          <w:t xml:space="preserve">1</w:t>
+        </w:r>
+      </w:hyperlink>
+      <w:r>
+        <w:t xml:space="preserve">] demonstrate that the ubiquitous</w:t>
+      </w:r>
+      <w:r>
+        <w:t xml:space="preserve"> </w:t>
+      </w:r>
+      <w:r>
+        <w:rPr>
+          <w:i/>
+          <w:iCs/>
+        </w:rPr>
+        <w:t xml:space="preserve">point-adjustment</w:t>
+      </w:r>
+      <w:r>
+        <w:t xml:space="preserve"> </w:t>
+      </w:r>
+      <w:r>
+        <w:t xml:space="preserve">protocol</w:t>
+      </w:r>
+      <w:r>
+        <w:t xml:space="preserve"> </w:t>
+      </w:r>
+      <w:r>
+        <w:t xml:space="preserve">(marking an entire ground-truth anomaly segment as detected if any single point in it is flagged) inflates</w:t>
+      </w:r>
+      <w:r>
+        <w:t xml:space="preserve"> </w:t>
+      </w:r>
+      <w:r>
+        <w:t xml:space="preserve">F1 so drastically that a</w:t>
+      </w:r>
+      <w:r>
+        <w:t xml:space="preserve"> </w:t>
+      </w:r>
+      <w:r>
+        <w:rPr>
+          <w:i/>
+          <w:iCs/>
+        </w:rPr>
+        <w:t xml:space="preserve">random</w:t>
+      </w:r>
+      <w:r>
+        <w:t xml:space="preserve"> </w:t>
+      </w:r>
+      <w:r>
+        <w:t xml:space="preserve">anomaly score achieves higher point-adjusted F1 than every state-of-the-art</w:t>
+      </w:r>
+      <w:r>
+        <w:t xml:space="preserve"> </w:t>
+      </w:r>
+      <w:r>
+        <w:t xml:space="preserve">model on SWaT and WADI. Garg et al. [</w:t>
+      </w:r>
+      <w:hyperlink w:anchor="r-garg">
+        <w:r>
+          <w:rPr>
+            <w:rStyle w:val="Hyperlink"/>
+          </w:rPr>
+          <w:t xml:space="preserve">2</w:t>
+        </w:r>
+      </w:hyperlink>
+      <w:r>
+        <w:t xml:space="preserve">] independently reproduce this inflation and show</w:t>
+      </w:r>
+      <w:r>
+        <w:t xml:space="preserve"> </w:t>
+      </w:r>
+      <w:r>
+        <w:t xml:space="preserve">that simple baselines (PCA, channel-wise autoencoders) beat elaborate deep models once metrics are made rigorous,</w:t>
+      </w:r>
+      <w:r>
+        <w:t xml:space="preserve"> </w:t>
+      </w:r>
+      <w:r>
+        <w:t xml:space="preserve">and that deep methods often fail to detect even simple anomalies. Doshi et al. [</w:t>
+      </w:r>
+      <w:hyperlink w:anchor="r-doshi">
+        <w:r>
+          <w:rPr>
+            <w:rStyle w:val="Hyperlink"/>
+          </w:rPr>
+          <w:t xml:space="preserve">4</w:t>
+        </w:r>
+      </w:hyperlink>
+      <w:r>
+        <w:t xml:space="preserve">]</w:t>
+      </w:r>
+      <w:r>
+        <w:t xml:space="preserve"> </w:t>
+      </w:r>
+      <w:r>
+        <w:t xml:space="preserve">diagnose the point-adjustment reward structure and propose a rectified evaluation. The critique now spans metrics and benchmarks alike. Wu and Keogh</w:t>
+      </w:r>
+      <w:r>
+        <w:t xml:space="preserve"> </w:t>
+      </w:r>
+      <w:r>
+        <w:t xml:space="preserve">[</w:t>
+      </w:r>
+      <w:hyperlink w:anchor="r-wukeogh">
+        <w:r>
+          <w:rPr>
+            <w:rStyle w:val="Hyperlink"/>
+          </w:rPr>
+          <w:t xml:space="preserve">3</w:t>
+        </w:r>
+      </w:hyperlink>
+      <w:r>
+        <w:t xml:space="preserve">] argue that many popular benchmarks are flawed (triviality, mislabelling and</w:t>
+      </w:r>
+      <w:r>
+        <w:t xml:space="preserve"> </w:t>
+      </w:r>
+      <w:r>
+        <w:t xml:space="preserve">unrealistic anomaly density) creating an illusion of progress; and a recent benchmark analysis</w:t>
+      </w:r>
+      <w:r>
+        <w:t xml:space="preserve"> </w:t>
+      </w:r>
+      <w:r>
+        <w:t xml:space="preserve">[</w:t>
+      </w:r>
+      <w:hyperlink w:anchor="r-univar">
+        <w:r>
+          <w:rPr>
+            <w:rStyle w:val="Hyperlink"/>
+          </w:rPr>
+          <w:t xml:space="preserve">5</w:t>
+        </w:r>
+      </w:hyperlink>
+      <w:r>
+        <w:t xml:space="preserve">] finds that anomaly segments in multivariate CPS benchmarks are mostly univariate</w:t>
+      </w:r>
+      <w:r>
+        <w:t xml:space="preserve"> </w:t>
+      </w:r>
+      <w:r>
+        <w:t xml:space="preserve">(SWaT and WADI sit among the datasets whose anomalies deviate univariately on close to all timesteps, with no</w:t>
+      </w:r>
+      <w:r>
+        <w:t xml:space="preserve"> </w:t>
+      </w:r>
+      <w:r>
+        <w:t xml:space="preserve">long cross-channel-only segments), so a flat univariate model matches channel-dependent deep detectors.</w:t>
+      </w:r>
+    </w:p>
+    <w:p>
+      <w:pPr>
+        <w:pStyle w:val="BodyText"/>
+        <w:jc w:val="both"/>
+        <w:keepNext w:val="0"/>
+        <w:keepLines w:val="0"/>
+        <w:widowControl w:val="1"/>
+      </w:pPr>
+      <w:r>
+        <w:t xml:space="preserve">A parallel critique targets the dominant scoring mechanism itself. Reconstruction-based detectors assume that a model trained to reconstruct normal data reconstructs anomalies worse; Bouman and Heskes [</w:t>
+      </w:r>
+      <w:hyperlink w:anchor="r-bouman">
+        <w:r>
+          <w:rPr>
+            <w:rStyle w:val="Hyperlink"/>
+          </w:rPr>
+          <w:t xml:space="preserve">16</w:t>
+        </w:r>
+      </w:hyperlink>
+      <w:r>
+        <w:t xml:space="preserve">] show this assumption is unreliable, because anomalies lying far from normal data can be reconstructed perfectly in practice, and Gong et al. [</w:t>
+      </w:r>
+      <w:hyperlink w:anchor="r-memae">
+        <w:r>
+          <w:rPr>
+            <w:rStyle w:val="Hyperlink"/>
+          </w:rPr>
+          <w:t xml:space="preserve">17</w:t>
+        </w:r>
+      </w:hyperlink>
+      <w:r>
+        <w:t xml:space="preserve">] earlier showed that a deep autoencoder generalises well enough to rebuild anomalies and miss them. This is the theoretical counterpart of our Table 2 result that the reconstruction residual is at or below chance on correlation-break faults, and it motivates scoring in a clustered latent rather than through a reconstruction residual. A position paper by Sarfraz et al. [</w:t>
+      </w:r>
+      <w:hyperlink w:anchor="r-sarfraz">
+        <w:r>
+          <w:rPr>
+            <w:rStyle w:val="Hyperlink"/>
+          </w:rPr>
+          <w:t xml:space="preserve">18</w:t>
+        </w:r>
+      </w:hyperlink>
+      <w:r>
+        <w:t xml:space="preserve">] draws the two threads together, characterising the field as plagued by flawed evaluation metrics, inconsistent benchmarking, and unjustified design choices, and showing that state-of-the-art deep detectors effectively learn linear mappings that simple baselines reproduce; Wagner et al. [</w:t>
+      </w:r>
+      <w:hyperlink w:anchor="r-timesead">
+        <w:r>
+          <w:rPr>
+            <w:rStyle w:val="Hyperlink"/>
+          </w:rPr>
+          <w:t xml:space="preserve">19</w:t>
+        </w:r>
+      </w:hyperlink>
+      <w:r>
+        <w:t xml:space="preserve">] re-audit the widely used multivariate benchmarks, discard the ones with erroneous labels, and note the absence of any standard evaluation metric.</w:t>
+      </w:r>
+    </w:p>
+    <w:p>
+      <w:pPr>
+        <w:pStyle w:val="BodyText"/>
+        <w:jc w:val="both"/>
+        <w:keepNext w:val="0"/>
+        <w:keepLines w:val="0"/>
+        <w:widowControl w:val="1"/>
+      </w:pPr>
+      <w:r>
+        <w:t xml:space="preserve">LatAD responds to these critiques directly. We report</w:t>
+      </w:r>
+      <w:r>
+        <w:t xml:space="preserve"> </w:t>
+      </w:r>
+      <w:r>
+        <w:rPr>
+          <w:i/>
+          <w:iCs/>
+        </w:rPr>
+        <w:t xml:space="preserve">raw</w:t>
+      </w:r>
+      <w:r>
+        <w:t xml:space="preserve"> </w:t>
+      </w:r>
+      <w:r>
+        <w:t xml:space="preserve">point-wise AUROC, F1 and FPR with no point</w:t>
+      </w:r>
+      <w:r>
+        <w:t xml:space="preserve"> </w:t>
+      </w:r>
+      <w:r>
+        <w:t xml:space="preserve">adjustment for any method; we stratify by a trivial-detector difficulty split so that the discriminative</w:t>
+      </w:r>
+      <w:r>
+        <w:t xml:space="preserve"> </w:t>
+      </w:r>
+      <w:r>
+        <w:t xml:space="preserve">difficult subset is reported separately from the easy majority that carries headline numbers; we match</w:t>
+      </w:r>
+      <w:r>
+        <w:t xml:space="preserve"> </w:t>
+      </w:r>
+      <w:r>
+        <w:t xml:space="preserve">prevalence before comparing F1 across subsets; and we re-compute the deep SOTA baselines (USAD, TranAD, GDN) with the</w:t>
+      </w:r>
+      <w:r>
+        <w:t xml:space="preserve"> </w:t>
+      </w:r>
+      <w:r>
+        <w:rPr>
+          <w:i/>
+          <w:iCs/>
+        </w:rPr>
+        <w:t xml:space="preserve">same</w:t>
+      </w:r>
+      <w:r>
+        <w:t xml:space="preserve"> </w:t>
+      </w:r>
+      <w:r>
+        <w:t xml:space="preserve">raw metrics rather than quoting their point-adjusted published figures. Under this protocol the</w:t>
+      </w:r>
+      <w:r>
+        <w:t xml:space="preserve"> </w:t>
+      </w:r>
+      <w:r>
+        <w:t xml:space="preserve">SOTA methods lose most of their apparent advantage on the difficult subset, which is exactly the phenomenon the</w:t>
+      </w:r>
+      <w:r>
+        <w:t xml:space="preserve"> </w:t>
+      </w:r>
+      <w:r>
+        <w:t xml:space="preserve">critique predicts.</w:t>
+      </w:r>
+    </w:p>
+    <w:bookmarkEnd w:id="11"/>
+    <w:bookmarkStart w:id="12" w:name="X301c8971cc47a3655bb4e21bc8bb65a2caac9d3"/>
+    <w:p>
+      <w:pPr>
+        <w:pStyle w:val="Heading3"/>
+        <w:keepNext/>
+        <w:keepLines/>
+        <w:widowControl w:val="1"/>
+      </w:pPr>
+      <w:r>
+        <w:t xml:space="preserve">2.2  Latent and clustering models for anomaly detection</w:t>
+      </w:r>
+    </w:p>
+    <w:p>
+      <w:pPr>
+        <w:pStyle w:val="FirstParagraph"/>
+        <w:jc w:val="both"/>
+        <w:keepNext w:val="0"/>
+        <w:keepLines w:val="0"/>
+        <w:widowControl w:val="1"/>
+      </w:pPr>
+      <w:r>
+        <w:t xml:space="preserve">Our representation is Variational Deep Embedding (VaDE) [</w:t>
+      </w:r>
+      <w:hyperlink w:anchor="r-vade">
+        <w:r>
+          <w:rPr>
+            <w:rStyle w:val="Hyperlink"/>
+          </w:rPr>
+          <w:t xml:space="preserve">8</w:t>
+        </w:r>
+      </w:hyperlink>
+      <w:r>
+        <w:t xml:space="preserve">], a VAE with a Gaussian-mixture</w:t>
+      </w:r>
+      <w:r>
+        <w:t xml:space="preserve"> </w:t>
+      </w:r>
+      <w:r>
+        <w:t xml:space="preserve">latent prior that learns representation and clusters jointly. DAGMM [</w:t>
+      </w:r>
+      <w:hyperlink w:anchor="r-dagmm">
+        <w:r>
+          <w:rPr>
+            <w:rStyle w:val="Hyperlink"/>
+          </w:rPr>
+          <w:t xml:space="preserve">9</w:t>
+        </w:r>
+      </w:hyperlink>
+      <w:r>
+        <w:t xml:space="preserve">] similarly couples</w:t>
+      </w:r>
+      <w:r>
+        <w:t xml:space="preserve"> </w:t>
+      </w:r>
+      <w:r>
+        <w:t xml:space="preserve">an autoencoder with a Gaussian-mixture energy for anomaly detection; we borrow its variance-collapse</w:t>
+      </w:r>
+      <w:r>
+        <w:t xml:space="preserve"> </w:t>
+      </w:r>
+      <w:r>
+        <w:t xml:space="preserve">regularisation but find, on these datasets, that scoring against explicit per-mode Gaussians in a jointly learned</w:t>
+      </w:r>
+      <w:r>
+        <w:t xml:space="preserve"> </w:t>
+      </w:r>
+      <w:r>
+        <w:t xml:space="preserve">latent outperforms a learned-Gaussian energy. Our whitened residual uses the Ledoit–Wolf shrinkage</w:t>
+      </w:r>
+      <w:r>
+        <w:t xml:space="preserve"> </w:t>
+      </w:r>
+      <w:r>
+        <w:t xml:space="preserve">covariance estimator [</w:t>
+      </w:r>
+      <w:hyperlink w:anchor="r-lw">
+        <w:r>
+          <w:rPr>
+            <w:rStyle w:val="Hyperlink"/>
+          </w:rPr>
+          <w:t xml:space="preserve">12</w:t>
+        </w:r>
+      </w:hyperlink>
+      <w:r>
+        <w:t xml:space="preserve">]. Classical baselines are Isolation Forest [</w:t>
+      </w:r>
+      <w:hyperlink w:anchor="r-if">
+        <w:r>
+          <w:rPr>
+            <w:rStyle w:val="Hyperlink"/>
+          </w:rPr>
+          <w:t xml:space="preserve">11</w:t>
+        </w:r>
+      </w:hyperlink>
+      <w:r>
+        <w:t xml:space="preserve">] and a deep autoencoder [</w:t>
+      </w:r>
+      <w:hyperlink w:anchor="r-aead">
+        <w:r>
+          <w:rPr>
+            <w:rStyle w:val="Hyperlink"/>
+          </w:rPr>
+          <w:t xml:space="preserve">21</w:t>
+        </w:r>
+      </w:hyperlink>
+      <w:r>
+        <w:t xml:space="preserve">], both fitted on the same window features, together with a trivial per-channel range detector that also defines the easy/difficult split.</w:t>
+      </w:r>
+    </w:p>
+    <w:bookmarkEnd w:id="12"/>
+    <w:bookmarkStart w:id="13" w:name="deep-multivariate-cps-anomaly-detection"/>
+    <w:p>
+      <w:pPr>
+        <w:pStyle w:val="Heading3"/>
+        <w:keepNext/>
+        <w:keepLines/>
+        <w:widowControl w:val="1"/>
+      </w:pPr>
+      <w:r>
+        <w:t xml:space="preserve">2.3  Deep multivariate CPS anomaly detection</w:t>
+      </w:r>
+    </w:p>
+    <w:p>
+      <w:pPr>
+        <w:pStyle w:val="FirstParagraph"/>
+        <w:jc w:val="both"/>
+        <w:keepNext w:val="0"/>
+        <w:keepLines w:val="0"/>
+        <w:widowControl w:val="1"/>
+      </w:pPr>
+      <w:r>
+        <w:t xml:space="preserve">USAD [</w:t>
+      </w:r>
+      <w:hyperlink w:anchor="r-usad">
+        <w:r>
+          <w:rPr>
+            <w:rStyle w:val="Hyperlink"/>
+          </w:rPr>
+          <w:t xml:space="preserve">6</w:t>
+        </w:r>
+      </w:hyperlink>
+      <w:r>
+        <w:t xml:space="preserve">] couples two adversarially trained autoencoders; TranAD [</w:t>
+      </w:r>
+      <w:hyperlink w:anchor="r-tranad">
+        <w:r>
+          <w:rPr>
+            <w:rStyle w:val="Hyperlink"/>
+          </w:rPr>
+          <w:t xml:space="preserve">7</w:t>
+        </w:r>
+      </w:hyperlink>
+      <w:r>
+        <w:t xml:space="preserve">] uses deep transformer networks with adversarial and self-conditioning training; GDN [</w:t>
+      </w:r>
+      <w:hyperlink w:anchor="r-gdn">
+        <w:r>
+          <w:rPr>
+            <w:rStyle w:val="Hyperlink"/>
+          </w:rPr>
+          <w:t xml:space="preserve">10</w:t>
+        </w:r>
+      </w:hyperlink>
+      <w:r>
+        <w:t xml:space="preserve">] learns a graph over channels and detects deviations from learned inter-channel relations.</w:t>
+      </w:r>
+      <w:r>
+        <w:t xml:space="preserve"> </w:t>
+      </w:r>
+      <w:r>
+        <w:t xml:space="preserve">These define the modern SOTA on SWaT/WADI-style benchmarks. We compare against all three under raw metrics (GDN on</w:t>
+      </w:r>
+      <w:r>
+        <w:t xml:space="preserve"> </w:t>
+      </w:r>
+      <w:r>
+        <w:t xml:space="preserve">WADI, where the graph-attention model fits our compute budget). Re-scored this way, all three</w:t>
+      </w:r>
+      <w:r>
+        <w:t xml:space="preserve"> </w:t>
+      </w:r>
+      <w:r>
+        <w:t xml:space="preserve">collapse on the difficult subset (on WADI, USAD 0.554, TranAD 0.547 and GDN 0.582, against our 0.726),</w:t>
+      </w:r>
+      <w:r>
+        <w:t xml:space="preserve"> </w:t>
+      </w:r>
+      <w:r>
+        <w:t xml:space="preserve">confirming that their apparent strength does not survive a raw, difficulty-stratified metric.</w:t>
+      </w:r>
+    </w:p>
+    <w:bookmarkEnd w:id="13"/>
+    <w:bookmarkStart w:id="14" w:name="benchmark-datasets"/>
+    <w:p>
+      <w:pPr>
+        <w:pStyle w:val="Heading3"/>
+        <w:keepNext/>
+        <w:keepLines/>
+        <w:widowControl w:val="1"/>
+      </w:pPr>
+      <w:r>
+        <w:t xml:space="preserve">2.4  Benchmark datasets</w:t>
+      </w:r>
+    </w:p>
+    <w:p>
+      <w:pPr>
+        <w:pStyle w:val="FirstParagraph"/>
+        <w:jc w:val="both"/>
+        <w:keepNext w:val="0"/>
+        <w:keepLines w:val="0"/>
+        <w:widowControl w:val="1"/>
+      </w:pPr>
+      <w:r>
+        <w:t xml:space="preserve">We evaluate on three real CPS testbeds chosen to span the modality axis of the MIIM thesis. WADI [</w:t>
+      </w:r>
+      <w:hyperlink w:anchor="r-wadi">
+        <w:r>
+          <w:rPr>
+            <w:rStyle w:val="Hyperlink"/>
+          </w:rPr>
+          <w:t xml:space="preserve">13</w:t>
+        </w:r>
+      </w:hyperlink>
+      <w:r>
+        <w:t xml:space="preserve">] is a 123-channel water-distribution testbed from iTrust, and SWaT [</w:t>
+      </w:r>
+      <w:hyperlink w:anchor="r-swat">
+        <w:r>
+          <w:rPr>
+            <w:rStyle w:val="Hyperlink"/>
+          </w:rPr>
+          <w:t xml:space="preserve">20</w:t>
+        </w:r>
+      </w:hyperlink>
+      <w:r>
+        <w:t xml:space="preserve">] is its 51-channel water-treatment sibling; the two are the de facto standard multivariate CPS benchmarks and the primary targets of the evaluation critique above [</w:t>
+      </w:r>
+      <w:hyperlink w:anchor="r-kim">
+        <w:r>
+          <w:rPr>
+            <w:rStyle w:val="Hyperlink"/>
+          </w:rPr>
+          <w:t xml:space="preserve">1</w:t>
+        </w:r>
+      </w:hyperlink>
+      <w:r>
+        <w:t xml:space="preserve">, </w:t>
+      </w:r>
+      <w:hyperlink w:anchor="r-wukeogh">
+        <w:r>
+          <w:rPr>
+            <w:rStyle w:val="Hyperlink"/>
+          </w:rPr>
+          <w:t xml:space="preserve">3</w:t>
+        </w:r>
+      </w:hyperlink>
+      <w:r>
+        <w:t xml:space="preserve">]. HAI [</w:t>
+      </w:r>
+      <w:hyperlink w:anchor="r-hai">
+        <w:r>
+          <w:rPr>
+            <w:rStyle w:val="Hyperlink"/>
+          </w:rPr>
+          <w:t xml:space="preserve">14</w:t>
+        </w:r>
+      </w:hyperlink>
+      <w:r>
+        <w:t xml:space="preserve">] is a 59-channel hardware-in-the-loop industrial control testbed spanning several coupled processes, the most strongly multimodal of the three. SKAB [</w:t>
+      </w:r>
+      <w:hyperlink w:anchor="r-skab">
+        <w:r>
+          <w:rPr>
+            <w:rStyle w:val="Hyperlink"/>
+          </w:rPr>
+          <w:t xml:space="preserve">15</w:t>
+        </w:r>
+      </w:hyperlink>
+      <w:r>
+        <w:t xml:space="preserve">] is a smaller, contaminated 8-channel rotor and water-circulation benchmark, near-unimodal and, by our analysis, the only genuinely subtle set (a trivial univariate rule is near chance on it). We report WADI, HAI and SKAB, which contrast a large multimodal distribution network, a strongly multimodal plant and a near-unimodal rotor, so the difficulty-stratified results read directly against the MIIM structure of each dataset.</w:t>
+      </w:r>
+    </w:p>
+    <w:bookmarkEnd w:id="14"/>
+    <w:bookmarkEnd w:id="15"/>
+    <w:bookmarkStart w:id="16" w:name="Xfdcce8d466a3f0d09792019706ab8acf076f115"/>
+    <w:p>
+      <w:pPr>
+        <w:pStyle w:val="Heading2"/>
+        <w:keepNext/>
+        <w:keepLines/>
+        <w:widowControl w:val="1"/>
+      </w:pPr>
+      <w:r>
+        <w:t xml:space="preserve">3  The MIIM assumptions about CPS normal data</w:t>
       </w:r>
     </w:p>
     <w:p>
@@ -918,7 +1595,7 @@
         <w:t xml:space="preserve"> </w:t>
       </w:r>
       <w:r>
-        <w:t xml:space="preserve">of CPS operation and each motivates a specific design choice in the detector of §3. We call the resulting</w:t>
+        <w:t xml:space="preserve">of CPS operation and each motivates a specific design choice in the detector of §4. We call the resulting</w:t>
       </w:r>
       <w:r>
         <w:t xml:space="preserve"> </w:t>
@@ -2604,7 +3281,7 @@
                 <w:rFonts w:ascii="Times New Roman" w:hAnsi="Times New Roman"/>
                 <w:sz w:val="19"/>
               </w:rPr>
-              <w:t xml:space="preserve">In principle a trajectory branch; on these snapshot-detectable public benchmarks it is inert (see §6), so the reported model is window-only.</w:t>
+              <w:t xml:space="preserve">In principle a trajectory branch; on these snapshot-detectable public benchmarks it is inert (see §7), so the reported model is window-only.</w:t>
             </w:r>
           </w:p>
         </w:tc>
@@ -2669,7 +3346,7 @@
         <w:t xml:space="preserve"> </w:t>
       </w:r>
       <w:r>
-        <w:t xml:space="preserve">within a run. An exploratory analysis of the three datasets (§4)</w:t>
+        <w:t xml:space="preserve">within a run. An exploratory analysis of the three datasets (§5)</w:t>
       </w:r>
       <w:r>
         <w:t xml:space="preserve"> </w:t>
@@ -2718,8 +3395,8 @@
         <w:t xml:space="preserve">detector or a raw reconstruction residual does not.</w:t>
       </w:r>
     </w:p>
-    <w:bookmarkEnd w:id="11"/>
-    <w:bookmarkStart w:id="19" w:name="method"/>
+    <w:bookmarkEnd w:id="16"/>
+    <w:bookmarkStart w:id="24" w:name="method"/>
     <w:p>
       <w:pPr>
         <w:pStyle w:val="Heading2"/>
@@ -2728,7 +3405,7 @@
         <w:widowControl w:val="1"/>
       </w:pPr>
       <w:r>
-        <w:t xml:space="preserve">3  Method</w:t>
+        <w:t xml:space="preserve">4  Method</w:t>
       </w:r>
     </w:p>
     <w:p>
@@ -2768,7 +3445,7 @@
         <w:t xml:space="preserve">latent, all calibrated on train-normal). We describe each in turn.</w:t>
       </w:r>
     </w:p>
-    <w:bookmarkStart w:id="12" w:name="Xdfe4fc768c349fce82ac84ed863f0c04923ca8d"/>
+    <w:bookmarkStart w:id="17" w:name="Xdfe4fc768c349fce82ac84ed863f0c04923ca8d"/>
     <w:p>
       <w:pPr>
         <w:pStyle w:val="Heading3"/>
@@ -2777,7 +3454,7 @@
         <w:widowControl w:val="1"/>
       </w:pPr>
       <w:r>
-        <w:t xml:space="preserve">3.1  Representation: Variational Deep Embedding (VaDE)</w:t>
+        <w:t xml:space="preserve">4.1  Representation: Variational Deep Embedding (VaDE)</w:t>
       </w:r>
     </w:p>
     <w:p>
@@ -3749,8 +4426,8 @@
         <w:t xml:space="preserve">plain-VAE pretraining, GMM initialisation on the encoded means, then joint optimisation of the full objective.</w:t>
       </w:r>
     </w:p>
-    <w:bookmarkEnd w:id="12"/>
-    <w:bookmarkStart w:id="13" w:name="scoring-why-we-drop-reconstruction"/>
+    <w:bookmarkEnd w:id="17"/>
+    <w:bookmarkStart w:id="18" w:name="scoring-why-we-drop-reconstruction"/>
     <w:p>
       <w:pPr>
         <w:pStyle w:val="Heading3"/>
@@ -3759,7 +4436,7 @@
         <w:widowControl w:val="1"/>
       </w:pPr>
       <w:r>
-        <w:t xml:space="preserve">3.2  Scoring: why we drop reconstruction</w:t>
+        <w:t xml:space="preserve">4.2  Scoring: why we drop reconstruction</w:t>
       </w:r>
     </w:p>
     <w:p>
@@ -4437,8 +5114,8 @@
         <w:t xml:space="preserve">and SKAB. The remaining scoring stack works entirely in the jointly learned latent.</w:t>
       </w:r>
     </w:p>
-    <w:bookmarkEnd w:id="13"/>
-    <w:bookmarkStart w:id="18" w:name="the-scoring-stack"/>
+    <w:bookmarkEnd w:id="18"/>
+    <w:bookmarkStart w:id="23" w:name="the-scoring-stack"/>
     <w:p>
       <w:pPr>
         <w:pStyle w:val="Heading3"/>
@@ -4447,7 +5124,7 @@
         <w:widowControl w:val="1"/>
       </w:pPr>
       <w:r>
-        <w:t xml:space="preserve">3.3  The scoring stack</w:t>
+        <w:t xml:space="preserve">4.3  The scoring stack</w:t>
       </w:r>
     </w:p>
     <w:p>
@@ -4512,7 +5189,7 @@
         <w:t xml:space="preserve">by the test batch.</w:t>
       </w:r>
     </w:p>
-    <w:bookmarkStart w:id="14" w:name="X2807910815522b43fde41ba8fefa5ee5fc2d499"/>
+    <w:bookmarkStart w:id="19" w:name="X2807910815522b43fde41ba8fefa5ee5fc2d499"/>
     <w:p>
       <w:pPr>
         <w:pStyle w:val="Heading4"/>
@@ -4761,8 +5438,8 @@
         </m:oMath>
       </m:oMathPara>
     </w:p>
-    <w:bookmarkEnd w:id="14"/>
-    <w:bookmarkStart w:id="15" w:name="iii-nearest-component-nll-rare-mode-safe"/>
+    <w:bookmarkEnd w:id="19"/>
+    <w:bookmarkStart w:id="20" w:name="iii-nearest-component-nll-rare-mode-safe"/>
     <w:p>
       <w:pPr>
         <w:pStyle w:val="Heading4"/>
@@ -5099,8 +5776,8 @@
         <w:t xml:space="preserve">.</w:t>
       </w:r>
     </w:p>
-    <w:bookmarkEnd w:id="15"/>
-    <w:bookmarkStart w:id="16" w:name="X78505e67f293a39aecd15b9a19e1c36794c124c"/>
+    <w:bookmarkEnd w:id="20"/>
+    <w:bookmarkStart w:id="21" w:name="X78505e67f293a39aecd15b9a19e1c36794c124c"/>
     <w:p>
       <w:pPr>
         <w:pStyle w:val="Heading4"/>
@@ -5477,8 +6154,8 @@
         <w:t xml:space="preserve">recovers exactly this pattern from train-normal alone.</w:t>
       </w:r>
     </w:p>
-    <w:bookmarkEnd w:id="16"/>
-    <w:bookmarkStart w:id="17" w:name="X062bb72765149a4b65822c7a87745a26c5d6484"/>
+    <w:bookmarkEnd w:id="21"/>
+    <w:bookmarkStart w:id="22" w:name="X062bb72765149a4b65822c7a87745a26c5d6484"/>
     <w:p>
       <w:pPr>
         <w:pStyle w:val="Heading4"/>
@@ -5907,10 +6584,10 @@
         <w:t xml:space="preserve">train-normal only.</w:t>
       </w:r>
     </w:p>
-    <w:bookmarkEnd w:id="17"/>
-    <w:bookmarkEnd w:id="18"/>
-    <w:bookmarkEnd w:id="19"/>
-    <w:bookmarkStart w:id="25" w:name="experimental-methodology"/>
+    <w:bookmarkEnd w:id="22"/>
+    <w:bookmarkEnd w:id="23"/>
+    <w:bookmarkEnd w:id="24"/>
+    <w:bookmarkStart w:id="30" w:name="experimental-methodology"/>
     <w:p>
       <w:pPr>
         <w:pStyle w:val="Heading2"/>
@@ -5919,10 +6596,10 @@
         <w:widowControl w:val="1"/>
       </w:pPr>
       <w:r>
-        <w:t xml:space="preserve">4  Experimental methodology</w:t>
+        <w:t xml:space="preserve">5  Experimental methodology</w:t>
       </w:r>
     </w:p>
-    <w:bookmarkStart w:id="20" w:name="datasets"/>
+    <w:bookmarkStart w:id="25" w:name="datasets"/>
     <w:p>
       <w:pPr>
         <w:pStyle w:val="Heading3"/>
@@ -5931,7 +6608,7 @@
         <w:widowControl w:val="1"/>
       </w:pPr>
       <w:r>
-        <w:t xml:space="preserve">4.1  Datasets</w:t>
+        <w:t xml:space="preserve">5.1  Datasets</w:t>
       </w:r>
     </w:p>
     <w:p>
@@ -6127,8 +6804,8 @@
         <w:t xml:space="preserve">univariate rule is near chance).</w:t>
       </w:r>
     </w:p>
-    <w:bookmarkEnd w:id="20"/>
-    <w:bookmarkStart w:id="21" w:name="windows-and-features"/>
+    <w:bookmarkEnd w:id="25"/>
+    <w:bookmarkStart w:id="26" w:name="windows-and-features"/>
     <w:p>
       <w:pPr>
         <w:pStyle w:val="Heading3"/>
@@ -6137,7 +6814,7 @@
         <w:widowControl w:val="1"/>
       </w:pPr>
       <w:r>
-        <w:t xml:space="preserve">4.2  Windows and features</w:t>
+        <w:t xml:space="preserve">5.2  Windows and features</w:t>
       </w:r>
     </w:p>
     <w:p>
@@ -6311,8 +6988,8 @@
         <w:t xml:space="preserve">any dataset and are not used in the reported model.</w:t>
       </w:r>
     </w:p>
-    <w:bookmarkEnd w:id="21"/>
-    <w:bookmarkStart w:id="22" w:name="difficulty-stratification"/>
+    <w:bookmarkEnd w:id="26"/>
+    <w:bookmarkStart w:id="27" w:name="difficulty-stratification"/>
     <w:p>
       <w:pPr>
         <w:pStyle w:val="Heading3"/>
@@ -6321,7 +6998,7 @@
         <w:widowControl w:val="1"/>
       </w:pPr>
       <w:r>
-        <w:t xml:space="preserve">4.3  Difficulty stratification</w:t>
+        <w:t xml:space="preserve">5.3  Difficulty stratification</w:t>
       </w:r>
     </w:p>
     <w:p>
@@ -6472,8 +7149,8 @@
         <w:t xml:space="preserve">discriminative one.</w:t>
       </w:r>
     </w:p>
-    <w:bookmarkEnd w:id="22"/>
-    <w:bookmarkStart w:id="23" w:name="comparable-metrics"/>
+    <w:bookmarkEnd w:id="27"/>
+    <w:bookmarkStart w:id="28" w:name="comparable-metrics"/>
     <w:p>
       <w:pPr>
         <w:pStyle w:val="Heading3"/>
@@ -6482,7 +7159,7 @@
         <w:widowControl w:val="1"/>
       </w:pPr>
       <w:r>
-        <w:t xml:space="preserve">4.4  Comparable metrics</w:t>
+        <w:t xml:space="preserve">5.4  Comparable metrics</w:t>
       </w:r>
     </w:p>
     <w:p>
@@ -6648,8 +7325,8 @@
         <w:t xml:space="preserve">flag.</w:t>
       </w:r>
     </w:p>
-    <w:bookmarkEnd w:id="23"/>
-    <w:bookmarkStart w:id="24" w:name="baselines-and-sota-re-computation"/>
+    <w:bookmarkEnd w:id="28"/>
+    <w:bookmarkStart w:id="29" w:name="baselines-and-sota-re-computation"/>
     <w:p>
       <w:pPr>
         <w:pStyle w:val="Heading3"/>
@@ -6658,7 +7335,7 @@
         <w:widowControl w:val="1"/>
       </w:pPr>
       <w:r>
-        <w:t xml:space="preserve">4.5  Baselines and SOTA re-computation</w:t>
+        <w:t xml:space="preserve">5.5  Baselines and SOTA re-computation</w:t>
       </w:r>
     </w:p>
     <w:p>
@@ -6791,7 +7468,7 @@
         <w:t xml:space="preserve"> </w:t>
       </w:r>
       <w:r>
-        <w:t xml:space="preserve">severely that a random score outscores every deep model (§7), so a fair comparison must use raw metrics for</w:t>
+        <w:t xml:space="preserve">severely that a random score outscores every deep model (§2), so a fair comparison must use raw metrics for</w:t>
       </w:r>
       <w:r>
         <w:t xml:space="preserve"> </w:t>
@@ -6819,7 +7496,7 @@
         <w:t xml:space="preserve"> </w:t>
       </w:r>
       <w:r>
-        <w:t xml:space="preserve">maximum absolute standardised per-channel window mean, the same score that defines the difficulty split (§4.3),</w:t>
+        <w:t xml:space="preserve">maximum absolute standardised per-channel window mean, the same score that defines the difficulty split (§5.3),</w:t>
       </w:r>
       <w:r>
         <w:t xml:space="preserve"> </w:t>
@@ -6828,9 +7505,9 @@
         <w:t xml:space="preserve">whose behaviour by construction is strong on Easy and near chance on Difficult.</w:t>
       </w:r>
     </w:p>
-    <w:bookmarkEnd w:id="24"/>
-    <w:bookmarkEnd w:id="25"/>
-    <w:bookmarkStart w:id="30" w:name="results"/>
+    <w:bookmarkEnd w:id="29"/>
+    <w:bookmarkEnd w:id="30"/>
+    <w:bookmarkStart w:id="35" w:name="results"/>
     <w:p>
       <w:pPr>
         <w:pStyle w:val="Heading2"/>
@@ -6839,7 +7516,7 @@
         <w:widowControl w:val="1"/>
       </w:pPr>
       <w:r>
-        <w:t xml:space="preserve">5  Results</w:t>
+        <w:t xml:space="preserve">6  Results</w:t>
       </w:r>
     </w:p>
     <w:p>
@@ -6907,7 +7584,7 @@
           <w:b w:val="0"/>
           <w:i/>
         </w:rPr>
-        <w:t>Per-dataset, per-subset results: [AUROC, F1, FPR]. F1 is prevalence-matched; the F1/FPR threshold is a disclosed oracle; AUROC is leak-free. Higher AUROC/F1 and lower FPR are better. Bold = best AUROC in that dataset×subset column (ties bolded jointly). “Ours” = VaDE family; the headline model is VaDE-hard+resid(auto). The trivial max|z| row is the univariate range rule that defines the difficulty split (§4.3): near-perfect on Easy (SKAB 1.000, HAI 0.966), near chance on Difficult (0.31–0.39), which is exactly what makes the split meaningful. GDN is reported on WADI only (§4.5); “n/a” marks a cell not run.</w:t>
+        <w:t>Per-dataset, per-subset results: [AUROC, F1, FPR]. F1 is prevalence-matched; the F1/FPR threshold is a disclosed oracle; AUROC is leak-free. Higher AUROC/F1 and lower FPR are better. Bold = best AUROC in that dataset×subset column (ties bolded jointly). “Ours” = VaDE family; the headline model is VaDE-hard+resid(auto). The trivial max|z| row is the univariate range rule that defines the difficulty split (§5.3): near-perfect on Easy (SKAB 1.000, HAI 0.966), near chance on Difficult (0.31–0.39), which is exactly what makes the split meaningful. GDN is reported on WADI only (§5.5); “n/a” marks a cell not run.</w:t>
       </w:r>
     </w:p>
     <w:tbl>
@@ -6916,7 +7593,7 @@
         <w:tblW w:type="pct" w:w="5000"/>
         <w:jc w:val="center"/>
         <w:tblLook w:firstRow="1" w:lastRow="0" w:firstColumn="0" w:lastColumn="0" w:noHBand="0" w:noVBand="0" w:val="0020"/>
-        <w:tblCaption w:val="Table 3. Per-dataset, per-subset results: [AUROC, F1, FPR]. F1 is prevalence-matched; the F1/FPR threshold is a disclosed oracle; AUROC is leak-free. Higher AUROC/F1 and lower FPR are better. Bold = best AUROC in that dataset×subset column (ties bolded jointly). “Ours” = VaDE family; the headline model is VaDE-hard+resid(auto). The trivial max|z| row is the univariate range rule that defines the difficulty split (§4.3): near-perfect on Easy (SKAB 1.000, HAI 0.966), near chance on Difficult (0.31–0.39), which is exactly what makes the split meaningful. GDN is reported on WADI only (§4.5); “n/a” marks a cell not run."/>
+        <w:tblCaption w:val="Table 3. Per-dataset, per-subset results: [AUROC, F1, FPR]. F1 is prevalence-matched; the F1/FPR threshold is a disclosed oracle; AUROC is leak-free. Higher AUROC/F1 and lower FPR are better. Bold = best AUROC in that dataset×subset column (ties bolded jointly). “Ours” = VaDE family; the headline model is VaDE-hard+resid(auto). The trivial max|z| row is the univariate range rule that defines the difficulty split (§5.3): near-perfect on Easy (SKAB 1.000, HAI 0.966), near chance on Difficult (0.31–0.39), which is exactly what makes the split meaningful. GDN is reported on WADI only (§5.5); “n/a” marks a cell not run."/>
         <w:tblLayout w:type="autofit"/>
         <w:tblBorders>
           <w:top w:val="single" w:sz="10" w:color="4F6272"/>
@@ -14984,7 +15661,7 @@
         </w:tc>
       </w:tr>
     </w:tbl>
-    <w:bookmarkStart w:id="29" w:name="reading-the-table"/>
+    <w:bookmarkStart w:id="34" w:name="reading-the-table"/>
     <w:p>
       <w:pPr>
         <w:pStyle w:val="Heading3"/>
@@ -14993,7 +15670,7 @@
         <w:widowControl w:val="1"/>
       </w:pPr>
       <w:r>
-        <w:t xml:space="preserve">5.1  Reading the table</w:t>
+        <w:t xml:space="preserve">6.1  Reading the table</w:t>
       </w:r>
     </w:p>
     <w:p>
@@ -15245,18 +15922,18 @@
           <wp:inline>
             <wp:extent cx="5943600" cy="2476500"/>
             <wp:effectExtent b="0" l="0" r="0" t="0"/>
-            <wp:docPr descr="Difficult-subset AUROC by method" title="" id="27" name="Picture"/>
+            <wp:docPr descr="Difficult-subset AUROC by method" title="" id="32" name="Picture"/>
             <a:graphic>
               <a:graphicData uri="http://schemas.openxmlformats.org/drawingml/2006/picture">
                 <pic:pic>
                   <pic:nvPicPr>
-                    <pic:cNvPr descr="figure1.png" id="28" name="Picture"/>
+                    <pic:cNvPr descr="figure1.png" id="33" name="Picture"/>
                     <pic:cNvPicPr>
                       <a:picLocks noChangeArrowheads="1" noChangeAspect="1"/>
                     </pic:cNvPicPr>
                   </pic:nvPicPr>
                   <pic:blipFill>
-                    <a:blip r:embed="rId26"/>
+                    <a:blip r:embed="rId31"/>
                     <a:stretch>
                       <a:fillRect/>
                     </a:stretch>
@@ -15314,9 +15991,9 @@
         <w:t>Difficult-subset AUROC by method. Our detector wins the difficult column on all three datasets: WADI 0.726 and HAI 0.831 by wide margins, SKAB 0.610 narrowly (vs USAD 0.591). All three deep SOTA methods (USAD, TranAD, and, on WADI, GDN) sit well below. The margin is largest on HAI and WADI, the two multimodal datasets the MIIM assumptions target; SKAB, the near-unimodal set, is the tightest. GDN was run on WADI only.</w:t>
       </w:r>
     </w:p>
-    <w:bookmarkEnd w:id="29"/>
-    <w:bookmarkEnd w:id="30"/>
-    <w:bookmarkStart w:id="31" w:name="discussion"/>
+    <w:bookmarkEnd w:id="34"/>
+    <w:bookmarkEnd w:id="35"/>
+    <w:bookmarkStart w:id="36" w:name="discussion"/>
     <w:p>
       <w:pPr>
         <w:pStyle w:val="Heading2"/>
@@ -15325,7 +16002,7 @@
         <w:widowControl w:val="1"/>
       </w:pPr>
       <w:r>
-        <w:t xml:space="preserve">6  Discussion</w:t>
+        <w:t xml:space="preserve">7  Discussion</w:t>
       </w:r>
     </w:p>
     <w:p>
@@ -15787,683 +16464,6 @@
         <w:t xml:space="preserve">raw metrics, which makes our numbers look lower than point-adjusted leaderboard figures by design.</w:t>
       </w:r>
     </w:p>
-    <w:bookmarkEnd w:id="31"/>
-    <w:bookmarkStart w:id="36" w:name="related-work"/>
-    <w:p>
-      <w:pPr>
-        <w:pStyle w:val="Heading2"/>
-        <w:keepNext/>
-        <w:keepLines/>
-        <w:widowControl w:val="1"/>
-      </w:pPr>
-      <w:r>
-        <w:t xml:space="preserve">7  Related work</w:t>
-      </w:r>
-    </w:p>
-    <w:p>
-      <w:pPr>
-        <w:pStyle w:val="FirstParagraph"/>
-        <w:jc w:val="both"/>
-        <w:keepNext w:val="0"/>
-        <w:keepLines w:val="0"/>
-        <w:widowControl w:val="1"/>
-      </w:pPr>
-      <w:r>
-        <w:t xml:space="preserve">Anomaly detection is the unsupervised or semi-supervised task of flagging departures from a model of normal behaviour, adopted precisely because labelled anomalies are too scarce to train a classifier [</w:t>
-      </w:r>
-      <w:hyperlink w:anchor="r-chandola">
-        <w:r>
-          <w:rPr>
-            <w:rStyle w:val="Hyperlink"/>
-          </w:rPr>
-          <w:t xml:space="preserve">22</w:t>
-        </w:r>
-      </w:hyperlink>
-      <w:r>
-        <w:t xml:space="preserve">, </w:t>
-      </w:r>
-      <w:hyperlink w:anchor="r-pang">
-        <w:r>
-          <w:rPr>
-            <w:rStyle w:val="Hyperlink"/>
-          </w:rPr>
-          <w:t xml:space="preserve">23</w:t>
-        </w:r>
-      </w:hyperlink>
-      <w:r>
-        <w:t xml:space="preserve">, </w:t>
-      </w:r>
-      <w:hyperlink w:anchor="r-ruff">
-        <w:r>
-          <w:rPr>
-            <w:rStyle w:val="Hyperlink"/>
-          </w:rPr>
-          <w:t xml:space="preserve">24</w:t>
-        </w:r>
-      </w:hyperlink>
-      <w:r>
-        <w:t xml:space="preserve">]. On time series it must additionally respect temporal and cross-channel dependence [</w:t>
-      </w:r>
-      <w:hyperlink w:anchor="r-tsreview">
-        <w:r>
-          <w:rPr>
-            <w:rStyle w:val="Hyperlink"/>
-          </w:rPr>
-          <w:t xml:space="preserve">25</w:t>
-        </w:r>
-      </w:hyperlink>
-      <w:r>
-        <w:t xml:space="preserve">], and on cyber-physical and industrial control systems it underpins physics-aware intrusion and fault detection [</w:t>
-      </w:r>
-      <w:hyperlink w:anchor="r-icssurvey">
-        <w:r>
-          <w:rPr>
-            <w:rStyle w:val="Hyperlink"/>
-          </w:rPr>
-          <w:t xml:space="preserve">26</w:t>
-        </w:r>
-      </w:hyperlink>
-      <w:r>
-        <w:t xml:space="preserve">]. LatAD sits squarely in this line: unsupervised, trained on normal only, and specialised to the multimodal structure of cyber-physical normal behaviour.</w:t>
-      </w:r>
-    </w:p>
-    <w:bookmarkStart w:id="32" w:name="Xd79ac398892bc84acd5a01a98e1c3327df498f0"/>
-    <w:p>
-      <w:pPr>
-        <w:pStyle w:val="Heading3"/>
-        <w:keepNext/>
-        <w:keepLines/>
-        <w:widowControl w:val="1"/>
-      </w:pPr>
-      <w:r>
-        <w:t xml:space="preserve">7.1  The illusion of progress in time-series anomaly-detection evaluation</w:t>
-      </w:r>
-    </w:p>
-    <w:p>
-      <w:pPr>
-        <w:pStyle w:val="FirstParagraph"/>
-        <w:jc w:val="both"/>
-        <w:keepNext w:val="0"/>
-        <w:keepLines w:val="0"/>
-        <w:widowControl w:val="1"/>
-      </w:pPr>
-      <w:r>
-        <w:t xml:space="preserve">A line of critical work shows that the standard evaluation of time-series anomaly detection is unreliable.</w:t>
-      </w:r>
-      <w:r>
-        <w:t xml:space="preserve"> </w:t>
-      </w:r>
-      <w:r>
-        <w:t xml:space="preserve">Kim et al. [</w:t>
-      </w:r>
-      <w:hyperlink w:anchor="r-kim">
-        <w:r>
-          <w:rPr>
-            <w:rStyle w:val="Hyperlink"/>
-          </w:rPr>
-          <w:t xml:space="preserve">1</w:t>
-        </w:r>
-      </w:hyperlink>
-      <w:r>
-        <w:t xml:space="preserve">] demonstrate that the ubiquitous</w:t>
-      </w:r>
-      <w:r>
-        <w:t xml:space="preserve"> </w:t>
-      </w:r>
-      <w:r>
-        <w:rPr>
-          <w:i/>
-          <w:iCs/>
-        </w:rPr>
-        <w:t xml:space="preserve">point-adjustment</w:t>
-      </w:r>
-      <w:r>
-        <w:t xml:space="preserve"> </w:t>
-      </w:r>
-      <w:r>
-        <w:t xml:space="preserve">protocol</w:t>
-      </w:r>
-      <w:r>
-        <w:t xml:space="preserve"> </w:t>
-      </w:r>
-      <w:r>
-        <w:t xml:space="preserve">(marking an entire ground-truth anomaly segment as detected if any single point in it is flagged) inflates</w:t>
-      </w:r>
-      <w:r>
-        <w:t xml:space="preserve"> </w:t>
-      </w:r>
-      <w:r>
-        <w:t xml:space="preserve">F1 so drastically that a</w:t>
-      </w:r>
-      <w:r>
-        <w:t xml:space="preserve"> </w:t>
-      </w:r>
-      <w:r>
-        <w:rPr>
-          <w:i/>
-          <w:iCs/>
-        </w:rPr>
-        <w:t xml:space="preserve">random</w:t>
-      </w:r>
-      <w:r>
-        <w:t xml:space="preserve"> </w:t>
-      </w:r>
-      <w:r>
-        <w:t xml:space="preserve">anomaly score achieves higher point-adjusted F1 than every state-of-the-art</w:t>
-      </w:r>
-      <w:r>
-        <w:t xml:space="preserve"> </w:t>
-      </w:r>
-      <w:r>
-        <w:t xml:space="preserve">model on SWaT and WADI. Garg et al. [</w:t>
-      </w:r>
-      <w:hyperlink w:anchor="r-garg">
-        <w:r>
-          <w:rPr>
-            <w:rStyle w:val="Hyperlink"/>
-          </w:rPr>
-          <w:t xml:space="preserve">2</w:t>
-        </w:r>
-      </w:hyperlink>
-      <w:r>
-        <w:t xml:space="preserve">] independently reproduce this inflation and show</w:t>
-      </w:r>
-      <w:r>
-        <w:t xml:space="preserve"> </w:t>
-      </w:r>
-      <w:r>
-        <w:t xml:space="preserve">that simple baselines (PCA, channel-wise autoencoders) beat elaborate deep models once metrics are made rigorous,</w:t>
-      </w:r>
-      <w:r>
-        <w:t xml:space="preserve"> </w:t>
-      </w:r>
-      <w:r>
-        <w:t xml:space="preserve">and that deep methods often fail to detect even simple anomalies. Doshi et al. [</w:t>
-      </w:r>
-      <w:hyperlink w:anchor="r-doshi">
-        <w:r>
-          <w:rPr>
-            <w:rStyle w:val="Hyperlink"/>
-          </w:rPr>
-          <w:t xml:space="preserve">4</w:t>
-        </w:r>
-      </w:hyperlink>
-      <w:r>
-        <w:t xml:space="preserve">]</w:t>
-      </w:r>
-      <w:r>
-        <w:t xml:space="preserve"> </w:t>
-      </w:r>
-      <w:r>
-        <w:t xml:space="preserve">diagnose the point-adjustment reward structure and propose a rectified evaluation. The critique now spans metrics and benchmarks alike. Wu and Keogh</w:t>
-      </w:r>
-      <w:r>
-        <w:t xml:space="preserve"> </w:t>
-      </w:r>
-      <w:r>
-        <w:t xml:space="preserve">[</w:t>
-      </w:r>
-      <w:hyperlink w:anchor="r-wukeogh">
-        <w:r>
-          <w:rPr>
-            <w:rStyle w:val="Hyperlink"/>
-          </w:rPr>
-          <w:t xml:space="preserve">3</w:t>
-        </w:r>
-      </w:hyperlink>
-      <w:r>
-        <w:t xml:space="preserve">] argue that many popular benchmarks are flawed (triviality, mislabelling and</w:t>
-      </w:r>
-      <w:r>
-        <w:t xml:space="preserve"> </w:t>
-      </w:r>
-      <w:r>
-        <w:t xml:space="preserve">unrealistic anomaly density) creating an illusion of progress; and a recent benchmark analysis</w:t>
-      </w:r>
-      <w:r>
-        <w:t xml:space="preserve"> </w:t>
-      </w:r>
-      <w:r>
-        <w:t xml:space="preserve">[</w:t>
-      </w:r>
-      <w:hyperlink w:anchor="r-univar">
-        <w:r>
-          <w:rPr>
-            <w:rStyle w:val="Hyperlink"/>
-          </w:rPr>
-          <w:t xml:space="preserve">5</w:t>
-        </w:r>
-      </w:hyperlink>
-      <w:r>
-        <w:t xml:space="preserve">] finds that anomaly segments in multivariate CPS benchmarks are mostly univariate</w:t>
-      </w:r>
-      <w:r>
-        <w:t xml:space="preserve"> </w:t>
-      </w:r>
-      <w:r>
-        <w:t xml:space="preserve">(SWaT and WADI sit among the datasets whose anomalies deviate univariately on close to all timesteps, with no</w:t>
-      </w:r>
-      <w:r>
-        <w:t xml:space="preserve"> </w:t>
-      </w:r>
-      <w:r>
-        <w:t xml:space="preserve">long cross-channel-only segments), so a flat univariate model matches channel-dependent deep detectors.</w:t>
-      </w:r>
-    </w:p>
-    <w:p>
-      <w:pPr>
-        <w:pStyle w:val="BodyText"/>
-        <w:jc w:val="both"/>
-        <w:keepNext w:val="0"/>
-        <w:keepLines w:val="0"/>
-        <w:widowControl w:val="1"/>
-      </w:pPr>
-      <w:r>
-        <w:t xml:space="preserve">A parallel critique targets the dominant scoring mechanism itself. Reconstruction-based detectors assume that a model trained to reconstruct normal data reconstructs anomalies worse; Bouman and Heskes [</w:t>
-      </w:r>
-      <w:hyperlink w:anchor="r-bouman">
-        <w:r>
-          <w:rPr>
-            <w:rStyle w:val="Hyperlink"/>
-          </w:rPr>
-          <w:t xml:space="preserve">16</w:t>
-        </w:r>
-      </w:hyperlink>
-      <w:r>
-        <w:t xml:space="preserve">] show this assumption is unreliable, because anomalies lying far from normal data can be reconstructed perfectly in practice, and Gong et al. [</w:t>
-      </w:r>
-      <w:hyperlink w:anchor="r-memae">
-        <w:r>
-          <w:rPr>
-            <w:rStyle w:val="Hyperlink"/>
-          </w:rPr>
-          <w:t xml:space="preserve">17</w:t>
-        </w:r>
-      </w:hyperlink>
-      <w:r>
-        <w:t xml:space="preserve">] earlier showed that a deep autoencoder generalises well enough to rebuild anomalies and miss them. This is the theoretical counterpart of our Table 2 result that the reconstruction residual is at or below chance on correlation-break faults, and it motivates scoring in a clustered latent rather than through a reconstruction residual. A position paper by Sarfraz et al. [</w:t>
-      </w:r>
-      <w:hyperlink w:anchor="r-sarfraz">
-        <w:r>
-          <w:rPr>
-            <w:rStyle w:val="Hyperlink"/>
-          </w:rPr>
-          <w:t xml:space="preserve">18</w:t>
-        </w:r>
-      </w:hyperlink>
-      <w:r>
-        <w:t xml:space="preserve">] draws the two threads together, characterising the field as plagued by flawed evaluation metrics, inconsistent benchmarking, and unjustified design choices, and showing that state-of-the-art deep detectors effectively learn linear mappings that simple baselines reproduce; Wagner et al. [</w:t>
-      </w:r>
-      <w:hyperlink w:anchor="r-timesead">
-        <w:r>
-          <w:rPr>
-            <w:rStyle w:val="Hyperlink"/>
-          </w:rPr>
-          <w:t xml:space="preserve">19</w:t>
-        </w:r>
-      </w:hyperlink>
-      <w:r>
-        <w:t xml:space="preserve">] re-audit the widely used multivariate benchmarks, discard the ones with erroneous labels, and note the absence of any standard evaluation metric.</w:t>
-      </w:r>
-    </w:p>
-    <w:p>
-      <w:pPr>
-        <w:pStyle w:val="BodyText"/>
-        <w:jc w:val="both"/>
-        <w:keepNext w:val="0"/>
-        <w:keepLines w:val="0"/>
-        <w:widowControl w:val="1"/>
-      </w:pPr>
-      <w:r>
-        <w:t xml:space="preserve">LatAD responds to these critiques directly. We report</w:t>
-      </w:r>
-      <w:r>
-        <w:t xml:space="preserve"> </w:t>
-      </w:r>
-      <w:r>
-        <w:rPr>
-          <w:i/>
-          <w:iCs/>
-        </w:rPr>
-        <w:t xml:space="preserve">raw</w:t>
-      </w:r>
-      <w:r>
-        <w:t xml:space="preserve"> </w:t>
-      </w:r>
-      <w:r>
-        <w:t xml:space="preserve">point-wise AUROC, F1 and FPR with no point</w:t>
-      </w:r>
-      <w:r>
-        <w:t xml:space="preserve"> </w:t>
-      </w:r>
-      <w:r>
-        <w:t xml:space="preserve">adjustment for any method; we stratify by a trivial-detector difficulty split so that the discriminative</w:t>
-      </w:r>
-      <w:r>
-        <w:t xml:space="preserve"> </w:t>
-      </w:r>
-      <w:r>
-        <w:t xml:space="preserve">difficult subset is reported separately from the easy majority that carries headline numbers; we match</w:t>
-      </w:r>
-      <w:r>
-        <w:t xml:space="preserve"> </w:t>
-      </w:r>
-      <w:r>
-        <w:t xml:space="preserve">prevalence before comparing F1 across subsets; and we re-compute the deep SOTA baselines (USAD, TranAD, GDN) with the</w:t>
-      </w:r>
-      <w:r>
-        <w:t xml:space="preserve"> </w:t>
-      </w:r>
-      <w:r>
-        <w:rPr>
-          <w:i/>
-          <w:iCs/>
-        </w:rPr>
-        <w:t xml:space="preserve">same</w:t>
-      </w:r>
-      <w:r>
-        <w:t xml:space="preserve"> </w:t>
-      </w:r>
-      <w:r>
-        <w:t xml:space="preserve">raw metrics rather than quoting their point-adjusted published figures. Under this protocol the</w:t>
-      </w:r>
-      <w:r>
-        <w:t xml:space="preserve"> </w:t>
-      </w:r>
-      <w:r>
-        <w:t xml:space="preserve">SOTA methods lose most of their apparent advantage on the difficult subset, which is exactly the phenomenon the</w:t>
-      </w:r>
-      <w:r>
-        <w:t xml:space="preserve"> </w:t>
-      </w:r>
-      <w:r>
-        <w:t xml:space="preserve">critique predicts.</w:t>
-      </w:r>
-    </w:p>
-    <w:bookmarkEnd w:id="32"/>
-    <w:bookmarkStart w:id="33" w:name="X301c8971cc47a3655bb4e21bc8bb65a2caac9d3"/>
-    <w:p>
-      <w:pPr>
-        <w:pStyle w:val="Heading3"/>
-        <w:keepNext/>
-        <w:keepLines/>
-        <w:widowControl w:val="1"/>
-      </w:pPr>
-      <w:r>
-        <w:t xml:space="preserve">7.2  Latent and clustering models for anomaly detection</w:t>
-      </w:r>
-    </w:p>
-    <w:p>
-      <w:pPr>
-        <w:pStyle w:val="FirstParagraph"/>
-        <w:jc w:val="both"/>
-        <w:keepNext w:val="0"/>
-        <w:keepLines w:val="0"/>
-        <w:widowControl w:val="1"/>
-      </w:pPr>
-      <w:r>
-        <w:t xml:space="preserve">Our representation is Variational Deep Embedding (VaDE) [</w:t>
-      </w:r>
-      <w:hyperlink w:anchor="r-vade">
-        <w:r>
-          <w:rPr>
-            <w:rStyle w:val="Hyperlink"/>
-          </w:rPr>
-          <w:t xml:space="preserve">8</w:t>
-        </w:r>
-      </w:hyperlink>
-      <w:r>
-        <w:t xml:space="preserve">], a VAE with a Gaussian-mixture</w:t>
-      </w:r>
-      <w:r>
-        <w:t xml:space="preserve"> </w:t>
-      </w:r>
-      <w:r>
-        <w:t xml:space="preserve">latent prior that learns representation and clusters jointly. DAGMM [</w:t>
-      </w:r>
-      <w:hyperlink w:anchor="r-dagmm">
-        <w:r>
-          <w:rPr>
-            <w:rStyle w:val="Hyperlink"/>
-          </w:rPr>
-          <w:t xml:space="preserve">9</w:t>
-        </w:r>
-      </w:hyperlink>
-      <w:r>
-        <w:t xml:space="preserve">] similarly couples</w:t>
-      </w:r>
-      <w:r>
-        <w:t xml:space="preserve"> </w:t>
-      </w:r>
-      <w:r>
-        <w:t xml:space="preserve">an autoencoder with a Gaussian-mixture energy for anomaly detection; we borrow its variance-collapse</w:t>
-      </w:r>
-      <w:r>
-        <w:t xml:space="preserve"> </w:t>
-      </w:r>
-      <w:r>
-        <w:t xml:space="preserve">regularisation but find, on these datasets, that scoring against explicit per-mode Gaussians in a jointly learned</w:t>
-      </w:r>
-      <w:r>
-        <w:t xml:space="preserve"> </w:t>
-      </w:r>
-      <w:r>
-        <w:t xml:space="preserve">latent outperforms a learned-Gaussian energy. Our whitened residual uses the Ledoit–Wolf shrinkage</w:t>
-      </w:r>
-      <w:r>
-        <w:t xml:space="preserve"> </w:t>
-      </w:r>
-      <w:r>
-        <w:t xml:space="preserve">covariance estimator [</w:t>
-      </w:r>
-      <w:hyperlink w:anchor="r-lw">
-        <w:r>
-          <w:rPr>
-            <w:rStyle w:val="Hyperlink"/>
-          </w:rPr>
-          <w:t xml:space="preserve">12</w:t>
-        </w:r>
-      </w:hyperlink>
-      <w:r>
-        <w:t xml:space="preserve">]. Classical baselines are Isolation Forest [</w:t>
-      </w:r>
-      <w:hyperlink w:anchor="r-if">
-        <w:r>
-          <w:rPr>
-            <w:rStyle w:val="Hyperlink"/>
-          </w:rPr>
-          <w:t xml:space="preserve">11</w:t>
-        </w:r>
-      </w:hyperlink>
-      <w:r>
-        <w:t xml:space="preserve">] and a deep autoencoder [</w:t>
-      </w:r>
-      <w:hyperlink w:anchor="r-aead">
-        <w:r>
-          <w:rPr>
-            <w:rStyle w:val="Hyperlink"/>
-          </w:rPr>
-          <w:t xml:space="preserve">21</w:t>
-        </w:r>
-      </w:hyperlink>
-      <w:r>
-        <w:t xml:space="preserve">], both fitted on the same window features, together with a trivial per-channel range detector that also defines the easy/difficult split.</w:t>
-      </w:r>
-    </w:p>
-    <w:bookmarkEnd w:id="33"/>
-    <w:bookmarkStart w:id="34" w:name="deep-multivariate-cps-anomaly-detection"/>
-    <w:p>
-      <w:pPr>
-        <w:pStyle w:val="Heading3"/>
-        <w:keepNext/>
-        <w:keepLines/>
-        <w:widowControl w:val="1"/>
-      </w:pPr>
-      <w:r>
-        <w:t xml:space="preserve">7.3  Deep multivariate CPS anomaly detection</w:t>
-      </w:r>
-    </w:p>
-    <w:p>
-      <w:pPr>
-        <w:pStyle w:val="FirstParagraph"/>
-        <w:jc w:val="both"/>
-        <w:keepNext w:val="0"/>
-        <w:keepLines w:val="0"/>
-        <w:widowControl w:val="1"/>
-      </w:pPr>
-      <w:r>
-        <w:t xml:space="preserve">USAD [</w:t>
-      </w:r>
-      <w:hyperlink w:anchor="r-usad">
-        <w:r>
-          <w:rPr>
-            <w:rStyle w:val="Hyperlink"/>
-          </w:rPr>
-          <w:t xml:space="preserve">6</w:t>
-        </w:r>
-      </w:hyperlink>
-      <w:r>
-        <w:t xml:space="preserve">] couples two adversarially trained autoencoders; TranAD [</w:t>
-      </w:r>
-      <w:hyperlink w:anchor="r-tranad">
-        <w:r>
-          <w:rPr>
-            <w:rStyle w:val="Hyperlink"/>
-          </w:rPr>
-          <w:t xml:space="preserve">7</w:t>
-        </w:r>
-      </w:hyperlink>
-      <w:r>
-        <w:t xml:space="preserve">] uses deep transformer networks with adversarial and self-conditioning training; GDN [</w:t>
-      </w:r>
-      <w:hyperlink w:anchor="r-gdn">
-        <w:r>
-          <w:rPr>
-            <w:rStyle w:val="Hyperlink"/>
-          </w:rPr>
-          <w:t xml:space="preserve">10</w:t>
-        </w:r>
-      </w:hyperlink>
-      <w:r>
-        <w:t xml:space="preserve">] learns a graph over channels and detects deviations from learned inter-channel relations.</w:t>
-      </w:r>
-      <w:r>
-        <w:t xml:space="preserve"> </w:t>
-      </w:r>
-      <w:r>
-        <w:t xml:space="preserve">These define the modern SOTA on SWaT/WADI-style benchmarks. We compare against all three under raw metrics (GDN on</w:t>
-      </w:r>
-      <w:r>
-        <w:t xml:space="preserve"> </w:t>
-      </w:r>
-      <w:r>
-        <w:t xml:space="preserve">WADI, where the graph-attention model fits our compute budget). Re-scored this way, all three</w:t>
-      </w:r>
-      <w:r>
-        <w:t xml:space="preserve"> </w:t>
-      </w:r>
-      <w:r>
-        <w:t xml:space="preserve">collapse on the difficult subset (on WADI, USAD 0.554, TranAD 0.547 and GDN 0.582, against our 0.726),</w:t>
-      </w:r>
-      <w:r>
-        <w:t xml:space="preserve"> </w:t>
-      </w:r>
-      <w:r>
-        <w:t xml:space="preserve">confirming that their apparent strength does not survive a raw, difficulty-stratified metric.</w:t>
-      </w:r>
-    </w:p>
-    <w:bookmarkEnd w:id="34"/>
-    <w:bookmarkStart w:id="35" w:name="datasets-1"/>
-    <w:p>
-      <w:pPr>
-        <w:pStyle w:val="Heading3"/>
-        <w:keepNext/>
-        <w:keepLines/>
-        <w:widowControl w:val="1"/>
-      </w:pPr>
-      <w:r>
-        <w:t xml:space="preserve">7.4  Datasets</w:t>
-      </w:r>
-    </w:p>
-    <w:p>
-      <w:pPr>
-        <w:pStyle w:val="FirstParagraph"/>
-        <w:jc w:val="both"/>
-        <w:keepNext w:val="0"/>
-        <w:keepLines w:val="0"/>
-        <w:widowControl w:val="1"/>
-      </w:pPr>
-      <w:r>
-        <w:t xml:space="preserve">We evaluate on three real CPS testbeds chosen to span the modality axis of the MIIM thesis. WADI [</w:t>
-      </w:r>
-      <w:hyperlink w:anchor="r-wadi">
-        <w:r>
-          <w:rPr>
-            <w:rStyle w:val="Hyperlink"/>
-          </w:rPr>
-          <w:t xml:space="preserve">13</w:t>
-        </w:r>
-      </w:hyperlink>
-      <w:r>
-        <w:t xml:space="preserve">] is a 123-channel water-distribution testbed from iTrust, and SWaT [</w:t>
-      </w:r>
-      <w:hyperlink w:anchor="r-swat">
-        <w:r>
-          <w:rPr>
-            <w:rStyle w:val="Hyperlink"/>
-          </w:rPr>
-          <w:t xml:space="preserve">20</w:t>
-        </w:r>
-      </w:hyperlink>
-      <w:r>
-        <w:t xml:space="preserve">] is its 51-channel water-treatment sibling; the two are the de facto standard multivariate CPS benchmarks and the primary targets of the evaluation critique above [</w:t>
-      </w:r>
-      <w:hyperlink w:anchor="r-kim">
-        <w:r>
-          <w:rPr>
-            <w:rStyle w:val="Hyperlink"/>
-          </w:rPr>
-          <w:t xml:space="preserve">1</w:t>
-        </w:r>
-      </w:hyperlink>
-      <w:r>
-        <w:t xml:space="preserve">, </w:t>
-      </w:r>
-      <w:hyperlink w:anchor="r-wukeogh">
-        <w:r>
-          <w:rPr>
-            <w:rStyle w:val="Hyperlink"/>
-          </w:rPr>
-          <w:t xml:space="preserve">3</w:t>
-        </w:r>
-      </w:hyperlink>
-      <w:r>
-        <w:t xml:space="preserve">]. HAI [</w:t>
-      </w:r>
-      <w:hyperlink w:anchor="r-hai">
-        <w:r>
-          <w:rPr>
-            <w:rStyle w:val="Hyperlink"/>
-          </w:rPr>
-          <w:t xml:space="preserve">14</w:t>
-        </w:r>
-      </w:hyperlink>
-      <w:r>
-        <w:t xml:space="preserve">] is a 59-channel hardware-in-the-loop industrial control testbed spanning several coupled processes, the most strongly multimodal of the three. SKAB [</w:t>
-      </w:r>
-      <w:hyperlink w:anchor="r-skab">
-        <w:r>
-          <w:rPr>
-            <w:rStyle w:val="Hyperlink"/>
-          </w:rPr>
-          <w:t xml:space="preserve">15</w:t>
-        </w:r>
-      </w:hyperlink>
-      <w:r>
-        <w:t xml:space="preserve">] is a smaller, contaminated 8-channel rotor and water-circulation benchmark, near-unimodal and, by our analysis, the only genuinely subtle set (a trivial univariate rule is near chance on it). We report WADI, HAI and SKAB, which contrast a large multimodal distribution network, a strongly multimodal plant and a near-unimodal rotor, so the difficulty-stratified results read directly against the MIIM structure of each dataset.</w:t>
-      </w:r>
-    </w:p>
-    <w:bookmarkEnd w:id="35"/>
     <w:bookmarkEnd w:id="36"/>
     <w:bookmarkStart w:id="37" w:name="conclusion"/>
     <w:p>

</xml_diff>

<commit_message>
paper: drop redundant 'In-text citations use the numbers below' note; rebuild DOCX
Co-Authored-By: Claude Opus 4.8 <noreply@anthropic.com>
</commit_message>
<xml_diff>
--- a/poc/paper/paper.docx
+++ b/poc/paper/paper.docx
@@ -16587,27 +16587,6 @@
         </w:rPr>
         <w:t xml:space="preserve">1. </w:t>
       </w:r>
-      <w:r>
-        <w:t xml:space="preserve">In-text citations use the numbers below.</w:t>
-      </w:r>
-    </w:p>
-    <w:p>
-      <w:pPr>
-        <w:pStyle w:val="ReferenceEntry"/>
-        <w:spacing w:after="100"/>
-        <w:ind w:left="475" w:hanging="475"/>
-        <w:jc w:val="left"/>
-        <w:keepNext w:val="0"/>
-        <w:keepLines w:val="0"/>
-        <w:widowControl w:val="1"/>
-      </w:pPr>
-      <w:r>
-        <w:rPr>
-          <w:rFonts w:ascii="Times New Roman" w:hAnsi="Times New Roman"/>
-          <w:sz w:val="20"/>
-        </w:rPr>
-        <w:t xml:space="preserve">2. </w:t>
-      </w:r>
       <w:bookmarkStart w:id="40" w:name="r-kim"/>
       <w:r>
         <w:t xml:space="preserve">S. Kim, K. Choi, H.-S. Choi, B. Lee, and S. Yoon. “Towards a Rigorous Evaluation of</w:t>
@@ -16682,7 +16661,7 @@
           <w:rFonts w:ascii="Times New Roman" w:hAnsi="Times New Roman"/>
           <w:sz w:val="20"/>
         </w:rPr>
-        <w:t xml:space="preserve">3. </w:t>
+        <w:t xml:space="preserve">2. </w:t>
       </w:r>
       <w:bookmarkStart w:id="42" w:name="r-garg"/>
       <w:r>
@@ -16758,7 +16737,7 @@
           <w:rFonts w:ascii="Times New Roman" w:hAnsi="Times New Roman"/>
           <w:sz w:val="20"/>
         </w:rPr>
-        <w:t xml:space="preserve">4. </w:t>
+        <w:t xml:space="preserve">3. </w:t>
       </w:r>
       <w:bookmarkStart w:id="44" w:name="r-wukeogh"/>
       <w:r>
@@ -16814,7 +16793,7 @@
           <w:rFonts w:ascii="Times New Roman" w:hAnsi="Times New Roman"/>
           <w:sz w:val="20"/>
         </w:rPr>
-        <w:t xml:space="preserve">5. </w:t>
+        <w:t xml:space="preserve">4. </w:t>
       </w:r>
       <w:bookmarkStart w:id="46" w:name="r-doshi"/>
       <w:r>
@@ -16870,7 +16849,7 @@
           <w:rFonts w:ascii="Times New Roman" w:hAnsi="Times New Roman"/>
           <w:sz w:val="20"/>
         </w:rPr>
-        <w:t xml:space="preserve">6. </w:t>
+        <w:t xml:space="preserve">5. </w:t>
       </w:r>
       <w:bookmarkStart w:id="48" w:name="r-univar"/>
       <w:r>
@@ -16913,7 +16892,7 @@
           <w:rFonts w:ascii="Times New Roman" w:hAnsi="Times New Roman"/>
           <w:sz w:val="20"/>
         </w:rPr>
-        <w:t xml:space="preserve">7. </w:t>
+        <w:t xml:space="preserve">6. </w:t>
       </w:r>
       <w:bookmarkStart w:id="50" w:name="r-usad"/>
       <w:r>
@@ -16983,7 +16962,7 @@
           <w:rFonts w:ascii="Times New Roman" w:hAnsi="Times New Roman"/>
           <w:sz w:val="20"/>
         </w:rPr>
-        <w:t xml:space="preserve">8. </w:t>
+        <w:t xml:space="preserve">7. </w:t>
       </w:r>
       <w:bookmarkStart w:id="52" w:name="r-tranad"/>
       <w:r>
@@ -17039,7 +17018,7 @@
           <w:rFonts w:ascii="Times New Roman" w:hAnsi="Times New Roman"/>
           <w:sz w:val="20"/>
         </w:rPr>
-        <w:t xml:space="preserve">9. </w:t>
+        <w:t xml:space="preserve">8. </w:t>
       </w:r>
       <w:bookmarkStart w:id="54" w:name="r-vade"/>
       <w:r>
@@ -17109,7 +17088,7 @@
           <w:rFonts w:ascii="Times New Roman" w:hAnsi="Times New Roman"/>
           <w:sz w:val="20"/>
         </w:rPr>
-        <w:t xml:space="preserve">10. </w:t>
+        <w:t xml:space="preserve">9. </w:t>
       </w:r>
       <w:bookmarkStart w:id="56" w:name="r-dagmm"/>
       <w:r>
@@ -17179,7 +17158,7 @@
           <w:rFonts w:ascii="Times New Roman" w:hAnsi="Times New Roman"/>
           <w:sz w:val="20"/>
         </w:rPr>
-        <w:t xml:space="preserve">11. </w:t>
+        <w:t xml:space="preserve">10. </w:t>
       </w:r>
       <w:bookmarkStart w:id="58" w:name="r-gdn"/>
       <w:r>
@@ -17235,7 +17214,7 @@
           <w:rFonts w:ascii="Times New Roman" w:hAnsi="Times New Roman"/>
           <w:sz w:val="20"/>
         </w:rPr>
-        <w:t xml:space="preserve">12. </w:t>
+        <w:t xml:space="preserve">11. </w:t>
       </w:r>
       <w:bookmarkStart w:id="60" w:name="r-if"/>
       <w:r>
@@ -17299,7 +17278,7 @@
           <w:rFonts w:ascii="Times New Roman" w:hAnsi="Times New Roman"/>
           <w:sz w:val="20"/>
         </w:rPr>
-        <w:t xml:space="preserve">13. </w:t>
+        <w:t xml:space="preserve">12. </w:t>
       </w:r>
       <w:bookmarkStart w:id="62" w:name="r-lw"/>
       <w:r>
@@ -17355,7 +17334,7 @@
           <w:rFonts w:ascii="Times New Roman" w:hAnsi="Times New Roman"/>
           <w:sz w:val="20"/>
         </w:rPr>
-        <w:t xml:space="preserve">14. </w:t>
+        <w:t xml:space="preserve">13. </w:t>
       </w:r>
       <w:bookmarkStart w:id="64" w:name="r-wadi"/>
       <w:r>
@@ -17425,7 +17404,7 @@
           <w:rFonts w:ascii="Times New Roman" w:hAnsi="Times New Roman"/>
           <w:sz w:val="20"/>
         </w:rPr>
-        <w:t xml:space="preserve">15. </w:t>
+        <w:t xml:space="preserve">14. </w:t>
       </w:r>
       <w:bookmarkStart w:id="66" w:name="r-hai"/>
       <w:r>
@@ -17481,7 +17460,7 @@
           <w:rFonts w:ascii="Times New Roman" w:hAnsi="Times New Roman"/>
           <w:sz w:val="20"/>
         </w:rPr>
-        <w:t xml:space="preserve">16. </w:t>
+        <w:t xml:space="preserve">15. </w:t>
       </w:r>
       <w:bookmarkStart w:id="68" w:name="r-skab"/>
       <w:r>
@@ -17524,7 +17503,7 @@
           <w:rFonts w:ascii="Times New Roman" w:hAnsi="Times New Roman"/>
           <w:sz w:val="20"/>
         </w:rPr>
-        <w:t xml:space="preserve">17. </w:t>
+        <w:t xml:space="preserve">16. </w:t>
       </w:r>
       <w:bookmarkStart w:id="70" w:name="r-bouman"/>
       <w:r>
@@ -17561,7 +17540,7 @@
           <w:rFonts w:ascii="Times New Roman" w:hAnsi="Times New Roman"/>
           <w:sz w:val="20"/>
         </w:rPr>
-        <w:t xml:space="preserve">18. </w:t>
+        <w:t xml:space="preserve">17. </w:t>
       </w:r>
       <w:bookmarkStart w:id="72" w:name="r-memae"/>
       <w:r>
@@ -17611,7 +17590,7 @@
           <w:rFonts w:ascii="Times New Roman" w:hAnsi="Times New Roman"/>
           <w:sz w:val="20"/>
         </w:rPr>
-        <w:t xml:space="preserve">19. </w:t>
+        <w:t xml:space="preserve">18. </w:t>
       </w:r>
       <w:bookmarkStart w:id="74" w:name="r-sarfraz"/>
       <w:r>
@@ -17661,7 +17640,7 @@
           <w:rFonts w:ascii="Times New Roman" w:hAnsi="Times New Roman"/>
           <w:sz w:val="20"/>
         </w:rPr>
-        <w:t xml:space="preserve">20. </w:t>
+        <w:t xml:space="preserve">19. </w:t>
       </w:r>
       <w:bookmarkStart w:id="76" w:name="r-timesead"/>
       <w:r>
@@ -17711,7 +17690,7 @@
           <w:rFonts w:ascii="Times New Roman" w:hAnsi="Times New Roman"/>
           <w:sz w:val="20"/>
         </w:rPr>
-        <w:t xml:space="preserve">21. </w:t>
+        <w:t xml:space="preserve">20. </w:t>
       </w:r>
       <w:bookmarkStart w:id="78" w:name="r-swat"/>
       <w:r>
@@ -17761,7 +17740,7 @@
           <w:rFonts w:ascii="Times New Roman" w:hAnsi="Times New Roman"/>
           <w:sz w:val="20"/>
         </w:rPr>
-        <w:t xml:space="preserve">22. </w:t>
+        <w:t xml:space="preserve">21. </w:t>
       </w:r>
       <w:bookmarkStart w:id="80" w:name="r-aead"/>
       <w:r>
@@ -17811,7 +17790,7 @@
           <w:rFonts w:ascii="Times New Roman" w:hAnsi="Times New Roman"/>
           <w:sz w:val="20"/>
         </w:rPr>
-        <w:t xml:space="preserve">23. </w:t>
+        <w:t xml:space="preserve">22. </w:t>
       </w:r>
       <w:bookmarkStart w:id="82" w:name="r-chandola"/>
       <w:r>
@@ -17861,7 +17840,7 @@
           <w:rFonts w:ascii="Times New Roman" w:hAnsi="Times New Roman"/>
           <w:sz w:val="20"/>
         </w:rPr>
-        <w:t xml:space="preserve">24. </w:t>
+        <w:t xml:space="preserve">23. </w:t>
       </w:r>
       <w:bookmarkStart w:id="84" w:name="r-pang"/>
       <w:r>
@@ -17911,7 +17890,7 @@
           <w:rFonts w:ascii="Times New Roman" w:hAnsi="Times New Roman"/>
           <w:sz w:val="20"/>
         </w:rPr>
-        <w:t xml:space="preserve">25. </w:t>
+        <w:t xml:space="preserve">24. </w:t>
       </w:r>
       <w:bookmarkStart w:id="86" w:name="r-ruff"/>
       <w:r>
@@ -17961,7 +17940,7 @@
           <w:rFonts w:ascii="Times New Roman" w:hAnsi="Times New Roman"/>
           <w:sz w:val="20"/>
         </w:rPr>
-        <w:t xml:space="preserve">26. </w:t>
+        <w:t xml:space="preserve">25. </w:t>
       </w:r>
       <w:bookmarkStart w:id="88" w:name="r-tsreview"/>
       <w:r>
@@ -18011,7 +17990,7 @@
           <w:rFonts w:ascii="Times New Roman" w:hAnsi="Times New Roman"/>
           <w:sz w:val="20"/>
         </w:rPr>
-        <w:t xml:space="preserve">27. </w:t>
+        <w:t xml:space="preserve">26. </w:t>
       </w:r>
       <w:bookmarkStart w:id="90" w:name="r-icssurvey"/>
       <w:r>

</xml_diff>

<commit_message>
paper: drop Contents ToC after abstract; rebuild DOCX
Co-Authored-By: Claude Opus 4.8 <noreply@anthropic.com>
</commit_message>
<xml_diff>
--- a/poc/paper/paper.docx
+++ b/poc/paper/paper.docx
@@ -314,71 +314,6 @@
       </w:r>
     </w:p>
     <w:bookmarkEnd w:id="9"/>
-    <w:p>
-      <w:pPr>
-        <w:pStyle w:val="BodyText"/>
-        <w:ind w:left="720" w:right="720" w:firstLine="0"/>
-        <w:jc w:val="both"/>
-        <w:keepNext w:val="0"/>
-        <w:keepLines w:val="0"/>
-        <w:widowControl w:val="1"/>
-      </w:pPr>
-      <w:r>
-        <w:rPr>
-          <w:b/>
-          <w:bCs/>
-        </w:rPr>
-        <w:t xml:space="preserve">Contents.</w:t>
-      </w:r>
-      <w:r>
-        <w:t xml:space="preserve"> </w:t>
-      </w:r>
-      <w:r>
-        <w:t xml:space="preserve">1 Introduction ·</w:t>
-      </w:r>
-      <w:r>
-        <w:t xml:space="preserve"> </w:t>
-      </w:r>
-      <w:r>
-        <w:t xml:space="preserve">2 Related work ·</w:t>
-      </w:r>
-      <w:r>
-        <w:t xml:space="preserve"> </w:t>
-      </w:r>
-      <w:r>
-        <w:t xml:space="preserve">3 The MIIM assumptions about CPS normal data ·</w:t>
-      </w:r>
-      <w:r>
-        <w:t xml:space="preserve"> </w:t>
-      </w:r>
-      <w:r>
-        <w:t xml:space="preserve">4 Method ·</w:t>
-      </w:r>
-      <w:r>
-        <w:t xml:space="preserve"> </w:t>
-      </w:r>
-      <w:r>
-        <w:t xml:space="preserve">5 Experimental methodology ·</w:t>
-      </w:r>
-      <w:r>
-        <w:t xml:space="preserve"> </w:t>
-      </w:r>
-      <w:r>
-        <w:t xml:space="preserve">6 Results ·</w:t>
-      </w:r>
-      <w:r>
-        <w:t xml:space="preserve"> </w:t>
-      </w:r>
-      <w:r>
-        <w:t xml:space="preserve">7 Discussion ·</w:t>
-      </w:r>
-      <w:r>
-        <w:t xml:space="preserve"> </w:t>
-      </w:r>
-      <w:r>
-        <w:t xml:space="preserve">8 Conclusion.</w:t>
-      </w:r>
-    </w:p>
     <w:bookmarkStart w:id="10" w:name="introduction"/>
     <w:p>
       <w:pPr>

</xml_diff>

<commit_message>
paper: fold §6.1 into Results; rekey run-in labels as findings (drop 'Reading the table'); rebuild DOCX
Co-Authored-By: Claude Opus 4.8 <noreply@anthropic.com>
</commit_message>
<xml_diff>
--- a/poc/paper/paper.docx
+++ b/poc/paper/paper.docx
@@ -2,7 +2,7 @@
 <file path=word/document.xml><?xml version="1.0" encoding="utf-8"?>
 <w:document xmlns:w="http://schemas.openxmlformats.org/wordprocessingml/2006/main" xmlns:m="http://schemas.openxmlformats.org/officeDocument/2006/math" xmlns:r="http://schemas.openxmlformats.org/officeDocument/2006/relationships" xmlns:o="urn:schemas-microsoft-com:office:office" xmlns:v="urn:schemas-microsoft-com:vml" xmlns:w10="urn:schemas-microsoft-com:office:word" xmlns:a="http://schemas.openxmlformats.org/drawingml/2006/main" xmlns:pic="http://schemas.openxmlformats.org/drawingml/2006/picture" xmlns:wp="http://schemas.openxmlformats.org/drawingml/2006/wordprocessingDrawing">
   <w:body>
-    <w:bookmarkStart w:id="92" w:name="X82f8a503c88a86fef885ebbff7266bf4401a396"/>
+    <w:bookmarkStart w:id="91" w:name="X82f8a503c88a86fef885ebbff7266bf4401a396"/>
     <w:p>
       <w:pPr>
         <w:pStyle w:val="Title"/>
@@ -7442,7 +7442,7 @@
     </w:p>
     <w:bookmarkEnd w:id="29"/>
     <w:bookmarkEnd w:id="30"/>
-    <w:bookmarkStart w:id="35" w:name="results"/>
+    <w:bookmarkStart w:id="34" w:name="results"/>
     <w:p>
       <w:pPr>
         <w:pStyle w:val="Heading2"/>
@@ -15596,21 +15596,10 @@
         </w:tc>
       </w:tr>
     </w:tbl>
-    <w:bookmarkStart w:id="34" w:name="reading-the-table"/>
     <w:p>
       <w:pPr>
-        <w:pStyle w:val="Heading3"/>
-        <w:keepNext/>
-        <w:keepLines/>
-        <w:widowControl w:val="1"/>
-      </w:pPr>
-      <w:r>
-        <w:t xml:space="preserve">6.1  Reading the table</w:t>
-      </w:r>
-    </w:p>
-    <w:p>
-      <w:pPr>
-        <w:pStyle w:val="FirstParagraph"/>
+        <w:pStyle w:val="BodyText"/>
+        <w:spacing w:before="240"/>
         <w:jc w:val="both"/>
         <w:keepNext w:val="0"/>
         <w:keepLines w:val="0"/>
@@ -15621,7 +15610,7 @@
           <w:b/>
           <w:bCs/>
         </w:rPr>
-        <w:t xml:space="preserve">Combined (All) column.</w:t>
+        <w:t xml:space="preserve">Overall detection.</w:t>
       </w:r>
       <w:r>
         <w:t xml:space="preserve"> </w:t>
@@ -15667,13 +15656,13 @@
           <w:b/>
           <w:bCs/>
         </w:rPr>
-        <w:t xml:space="preserve">Difficult column.</w:t>
-      </w:r>
-      <w:r>
-        <w:t xml:space="preserve"> </w:t>
-      </w:r>
-      <w:r>
-        <w:t xml:space="preserve">This is where the design earns its keep, and the model leads it on all three</w:t>
+        <w:t xml:space="preserve">Difficult, joint-structure faults.</w:t>
+      </w:r>
+      <w:r>
+        <w:t xml:space="preserve"> </w:t>
+      </w:r>
+      <w:r>
+        <w:t xml:space="preserve">This is where the design earns its keep, and the model leads the difficult subset on all three</w:t>
       </w:r>
       <w:r>
         <w:t xml:space="preserve"> </w:t>
@@ -15725,13 +15714,13 @@
           <w:b/>
           <w:bCs/>
         </w:rPr>
-        <w:t xml:space="preserve">Easy column.</w:t>
-      </w:r>
-      <w:r>
-        <w:t xml:space="preserve"> </w:t>
-      </w:r>
-      <w:r>
-        <w:t xml:space="preserve">On the trivially separable anomalies every method is strong and the ranking is</w:t>
+        <w:t xml:space="preserve">Trivially separable anomalies.</w:t>
+      </w:r>
+      <w:r>
+        <w:t xml:space="preserve"> </w:t>
+      </w:r>
+      <w:r>
+        <w:t xml:space="preserve">On the easy subset every method is strong and the ranking is</w:t>
       </w:r>
       <w:r>
         <w:t xml:space="preserve"> </w:t>
@@ -15771,7 +15760,7 @@
           <w:b/>
           <w:bCs/>
         </w:rPr>
-        <w:t xml:space="preserve">The trivial baseline defines the split.</w:t>
+        <w:t xml:space="preserve">Validity of the difficulty split.</w:t>
       </w:r>
       <w:r>
         <w:t xml:space="preserve"> </w:t>
@@ -15811,7 +15800,7 @@
           <w:b/>
           <w:bCs/>
         </w:rPr>
-        <w:t xml:space="preserve">SOTA under raw metrics.</w:t>
+        <w:t xml:space="preserve">Deep SOTA under raw metrics.</w:t>
       </w:r>
       <w:r>
         <w:t xml:space="preserve"> </w:t>
@@ -15927,8 +15916,7 @@
       </w:r>
     </w:p>
     <w:bookmarkEnd w:id="34"/>
-    <w:bookmarkEnd w:id="35"/>
-    <w:bookmarkStart w:id="36" w:name="discussion"/>
+    <w:bookmarkStart w:id="35" w:name="discussion"/>
     <w:p>
       <w:pPr>
         <w:pStyle w:val="Heading2"/>
@@ -16399,8 +16387,8 @@
         <w:t xml:space="preserve">raw metrics, which makes our numbers look lower than point-adjusted leaderboard figures by design.</w:t>
       </w:r>
     </w:p>
-    <w:bookmarkEnd w:id="36"/>
-    <w:bookmarkStart w:id="37" w:name="conclusion"/>
+    <w:bookmarkEnd w:id="35"/>
+    <w:bookmarkStart w:id="36" w:name="conclusion"/>
     <w:p>
       <w:pPr>
         <w:pStyle w:val="Heading2"/>
@@ -16491,8 +16479,8 @@
         </w:pict>
       </w:r>
     </w:p>
-    <w:bookmarkEnd w:id="37"/>
-    <w:bookmarkStart w:id="91" w:name="references"/>
+    <w:bookmarkEnd w:id="36"/>
+    <w:bookmarkStart w:id="90" w:name="references"/>
     <w:p>
       <w:pPr>
         <w:pStyle w:val="ReferencesHeading"/>
@@ -16522,7 +16510,7 @@
         </w:rPr>
         <w:t xml:space="preserve">1. </w:t>
       </w:r>
-      <w:bookmarkStart w:id="40" w:name="r-kim"/>
+      <w:bookmarkStart w:id="39" w:name="r-kim"/>
       <w:r>
         <w:t xml:space="preserve">S. Kim, K. Choi, H.-S. Choi, B. Lee, and S. Yoon. “Towards a Rigorous Evaluation of</w:t>
       </w:r>
@@ -16554,7 +16542,7 @@
       <w:r>
         <w:t xml:space="preserve"> </w:t>
       </w:r>
-      <w:hyperlink r:id="rId38">
+      <w:hyperlink r:id="rId37">
         <w:r>
           <w:rPr>
             <w:rStyle w:val="Hyperlink"/>
@@ -16568,7 +16556,7 @@
       <w:r>
         <w:t xml:space="preserve"> </w:t>
       </w:r>
-      <w:hyperlink r:id="rId39">
+      <w:hyperlink r:id="rId38">
         <w:r>
           <w:rPr>
             <w:rStyle w:val="Hyperlink"/>
@@ -16579,7 +16567,7 @@
       <w:r>
         <w:t xml:space="preserve">.</w:t>
       </w:r>
-      <w:bookmarkEnd w:id="40"/>
+      <w:bookmarkEnd w:id="39"/>
     </w:p>
     <w:p>
       <w:pPr>
@@ -16598,7 +16586,7 @@
         </w:rPr>
         <w:t xml:space="preserve">2. </w:t>
       </w:r>
-      <w:bookmarkStart w:id="42" w:name="r-garg"/>
+      <w:bookmarkStart w:id="41" w:name="r-garg"/>
       <w:r>
         <w:t xml:space="preserve">A. Garg, W. Zhang, J. Samaran, R. Savitha, and C.-S. Foo. “An Evaluation of Anomaly</w:t>
       </w:r>
@@ -16638,7 +16626,7 @@
       <w:r>
         <w:t xml:space="preserve"> </w:t>
       </w:r>
-      <w:hyperlink r:id="rId41">
+      <w:hyperlink r:id="rId40">
         <w:r>
           <w:rPr>
             <w:rStyle w:val="Hyperlink"/>
@@ -16655,7 +16643,7 @@
       <w:r>
         <w:t xml:space="preserve">doi:10.1109/TNNLS.2021.3105827.</w:t>
       </w:r>
-      <w:bookmarkEnd w:id="42"/>
+      <w:bookmarkEnd w:id="41"/>
     </w:p>
     <w:p>
       <w:pPr>
@@ -16674,7 +16662,7 @@
         </w:rPr>
         <w:t xml:space="preserve">3. </w:t>
       </w:r>
-      <w:bookmarkStart w:id="44" w:name="r-wukeogh"/>
+      <w:bookmarkStart w:id="43" w:name="r-wukeogh"/>
       <w:r>
         <w:t xml:space="preserve">R. Wu and E. J. Keogh. “Current Time Series Anomaly Detection Benchmarks are Flawed and</w:t>
       </w:r>
@@ -16700,7 +16688,7 @@
       <w:r>
         <w:t xml:space="preserve"> </w:t>
       </w:r>
-      <w:hyperlink r:id="rId43">
+      <w:hyperlink r:id="rId42">
         <w:r>
           <w:rPr>
             <w:rStyle w:val="Hyperlink"/>
@@ -16711,7 +16699,7 @@
       <w:r>
         <w:t xml:space="preserve">, doi:10.1109/TKDE.2021.3112126.</w:t>
       </w:r>
-      <w:bookmarkEnd w:id="44"/>
+      <w:bookmarkEnd w:id="43"/>
     </w:p>
     <w:p>
       <w:pPr>
@@ -16730,7 +16718,7 @@
         </w:rPr>
         <w:t xml:space="preserve">4. </w:t>
       </w:r>
-      <w:bookmarkStart w:id="46" w:name="r-doshi"/>
+      <w:bookmarkStart w:id="45" w:name="r-doshi"/>
       <w:r>
         <w:t xml:space="preserve">K. Doshi, S. Abudalou, and Y. Yilmaz. “Reward Once, Penalize Once: Rectifying Time Series</w:t>
       </w:r>
@@ -16756,7 +16744,7 @@
       <w:r>
         <w:t xml:space="preserve"> </w:t>
       </w:r>
-      <w:hyperlink r:id="rId45">
+      <w:hyperlink r:id="rId44">
         <w:r>
           <w:rPr>
             <w:rStyle w:val="Hyperlink"/>
@@ -16767,7 +16755,7 @@
       <w:r>
         <w:t xml:space="preserve">.</w:t>
       </w:r>
-      <w:bookmarkEnd w:id="46"/>
+      <w:bookmarkEnd w:id="45"/>
     </w:p>
     <w:p>
       <w:pPr>
@@ -16786,7 +16774,7 @@
         </w:rPr>
         <w:t xml:space="preserve">5. </w:t>
       </w:r>
-      <w:bookmarkStart w:id="48" w:name="r-univar"/>
+      <w:bookmarkStart w:id="47" w:name="r-univar"/>
       <w:r>
         <w:t xml:space="preserve">M. Pinet, J. Cumin, S. Berlemont, and D. Vaufreydaz. “Anomalies in Multivariate Time Series</w:t>
       </w:r>
@@ -16799,7 +16787,7 @@
       <w:r>
         <w:t xml:space="preserve"> </w:t>
       </w:r>
-      <w:hyperlink r:id="rId47">
+      <w:hyperlink r:id="rId46">
         <w:r>
           <w:rPr>
             <w:rStyle w:val="Hyperlink"/>
@@ -16810,7 +16798,7 @@
       <w:r>
         <w:t xml:space="preserve">.</w:t>
       </w:r>
-      <w:bookmarkEnd w:id="48"/>
+      <w:bookmarkEnd w:id="47"/>
     </w:p>
     <w:p>
       <w:pPr>
@@ -16829,7 +16817,7 @@
         </w:rPr>
         <w:t xml:space="preserve">6. </w:t>
       </w:r>
-      <w:bookmarkStart w:id="50" w:name="r-usad"/>
+      <w:bookmarkStart w:id="49" w:name="r-usad"/>
       <w:r>
         <w:t xml:space="preserve">J. Audibert, P. Michiardi, F. Guyard, S. Marti, and M. A. Zuluaga. “USAD: UnSupervised</w:t>
       </w:r>
@@ -16869,7 +16857,7 @@
       <w:r>
         <w:t xml:space="preserve"> </w:t>
       </w:r>
-      <w:hyperlink r:id="rId49">
+      <w:hyperlink r:id="rId48">
         <w:r>
           <w:rPr>
             <w:rStyle w:val="Hyperlink"/>
@@ -16880,7 +16868,7 @@
       <w:r>
         <w:t xml:space="preserve">.</w:t>
       </w:r>
-      <w:bookmarkEnd w:id="50"/>
+      <w:bookmarkEnd w:id="49"/>
     </w:p>
     <w:p>
       <w:pPr>
@@ -16899,7 +16887,7 @@
         </w:rPr>
         <w:t xml:space="preserve">7. </w:t>
       </w:r>
-      <w:bookmarkStart w:id="52" w:name="r-tranad"/>
+      <w:bookmarkStart w:id="51" w:name="r-tranad"/>
       <w:r>
         <w:t xml:space="preserve">S. Tuli, G. Casale, and N. R. Jennings. “TranAD: Deep Transformer Networks for Anomaly</w:t>
       </w:r>
@@ -16925,7 +16913,7 @@
       <w:r>
         <w:t xml:space="preserve"> </w:t>
       </w:r>
-      <w:hyperlink r:id="rId51">
+      <w:hyperlink r:id="rId50">
         <w:r>
           <w:rPr>
             <w:rStyle w:val="Hyperlink"/>
@@ -16936,7 +16924,7 @@
       <w:r>
         <w:t xml:space="preserve">.</w:t>
       </w:r>
-      <w:bookmarkEnd w:id="52"/>
+      <w:bookmarkEnd w:id="51"/>
     </w:p>
     <w:p>
       <w:pPr>
@@ -16955,7 +16943,7 @@
         </w:rPr>
         <w:t xml:space="preserve">8. </w:t>
       </w:r>
-      <w:bookmarkStart w:id="54" w:name="r-vade"/>
+      <w:bookmarkStart w:id="53" w:name="r-vade"/>
       <w:r>
         <w:t xml:space="preserve">Z. Jiang, Y. Zheng, H. Tan, B. Tang, and H. Zhou. “Variational Deep Embedding: An</w:t>
       </w:r>
@@ -16995,7 +16983,7 @@
       <w:r>
         <w:t xml:space="preserve"> </w:t>
       </w:r>
-      <w:hyperlink r:id="rId53">
+      <w:hyperlink r:id="rId52">
         <w:r>
           <w:rPr>
             <w:rStyle w:val="Hyperlink"/>
@@ -17006,7 +16994,7 @@
       <w:r>
         <w:t xml:space="preserve">.</w:t>
       </w:r>
-      <w:bookmarkEnd w:id="54"/>
+      <w:bookmarkEnd w:id="53"/>
     </w:p>
     <w:p>
       <w:pPr>
@@ -17025,7 +17013,7 @@
         </w:rPr>
         <w:t xml:space="preserve">9. </w:t>
       </w:r>
-      <w:bookmarkStart w:id="56" w:name="r-dagmm"/>
+      <w:bookmarkStart w:id="55" w:name="r-dagmm"/>
       <w:r>
         <w:t xml:space="preserve">B. Zong, Q. Song, M. R. Min, W. Cheng, C. Lumezanu, D. Cho, and H. Chen. “Deep</w:t>
       </w:r>
@@ -17065,7 +17053,7 @@
       <w:r>
         <w:t xml:space="preserve"> </w:t>
       </w:r>
-      <w:hyperlink r:id="rId55">
+      <w:hyperlink r:id="rId54">
         <w:r>
           <w:rPr>
             <w:rStyle w:val="Hyperlink"/>
@@ -17076,7 +17064,7 @@
       <w:r>
         <w:t xml:space="preserve">.</w:t>
       </w:r>
-      <w:bookmarkEnd w:id="56"/>
+      <w:bookmarkEnd w:id="55"/>
     </w:p>
     <w:p>
       <w:pPr>
@@ -17095,7 +17083,7 @@
         </w:rPr>
         <w:t xml:space="preserve">10. </w:t>
       </w:r>
-      <w:bookmarkStart w:id="58" w:name="r-gdn"/>
+      <w:bookmarkStart w:id="57" w:name="r-gdn"/>
       <w:r>
         <w:t xml:space="preserve">A. Deng and B. Hooi. “Graph Neural Network-Based Anomaly Detection in Multivariate Time</w:t>
       </w:r>
@@ -17121,7 +17109,7 @@
       <w:r>
         <w:t xml:space="preserve"> </w:t>
       </w:r>
-      <w:hyperlink r:id="rId57">
+      <w:hyperlink r:id="rId56">
         <w:r>
           <w:rPr>
             <w:rStyle w:val="Hyperlink"/>
@@ -17132,7 +17120,7 @@
       <w:r>
         <w:t xml:space="preserve">.</w:t>
       </w:r>
-      <w:bookmarkEnd w:id="58"/>
+      <w:bookmarkEnd w:id="57"/>
     </w:p>
     <w:p>
       <w:pPr>
@@ -17151,7 +17139,7 @@
         </w:rPr>
         <w:t xml:space="preserve">11. </w:t>
       </w:r>
-      <w:bookmarkStart w:id="60" w:name="r-if"/>
+      <w:bookmarkStart w:id="59" w:name="r-if"/>
       <w:r>
         <w:t xml:space="preserve">F. T. Liu, K. M. Ting, and Z.-H. Zhou. “Isolation Forest.”</w:t>
       </w:r>
@@ -17185,7 +17173,7 @@
       <w:r>
         <w:t xml:space="preserve"> </w:t>
       </w:r>
-      <w:hyperlink r:id="rId59">
+      <w:hyperlink r:id="rId58">
         <w:r>
           <w:rPr>
             <w:rStyle w:val="Hyperlink"/>
@@ -17196,7 +17184,7 @@
       <w:r>
         <w:t xml:space="preserve">.</w:t>
       </w:r>
-      <w:bookmarkEnd w:id="60"/>
+      <w:bookmarkEnd w:id="59"/>
     </w:p>
     <w:p>
       <w:pPr>
@@ -17215,7 +17203,7 @@
         </w:rPr>
         <w:t xml:space="preserve">12. </w:t>
       </w:r>
-      <w:bookmarkStart w:id="62" w:name="r-lw"/>
+      <w:bookmarkStart w:id="61" w:name="r-lw"/>
       <w:r>
         <w:t xml:space="preserve">O. Ledoit and M. Wolf. “A Well-Conditioned Estimator for Large-Dimensional Covariance</w:t>
       </w:r>
@@ -17241,7 +17229,7 @@
       <w:r>
         <w:t xml:space="preserve"> </w:t>
       </w:r>
-      <w:hyperlink r:id="rId61">
+      <w:hyperlink r:id="rId60">
         <w:r>
           <w:rPr>
             <w:rStyle w:val="Hyperlink"/>
@@ -17252,7 +17240,7 @@
       <w:r>
         <w:t xml:space="preserve">.</w:t>
       </w:r>
-      <w:bookmarkEnd w:id="62"/>
+      <w:bookmarkEnd w:id="61"/>
     </w:p>
     <w:p>
       <w:pPr>
@@ -17271,7 +17259,7 @@
         </w:rPr>
         <w:t xml:space="preserve">13. </w:t>
       </w:r>
-      <w:bookmarkStart w:id="64" w:name="r-wadi"/>
+      <w:bookmarkStart w:id="63" w:name="r-wadi"/>
       <w:r>
         <w:t xml:space="preserve">C. M. Ahmed, V. R. Palleti, and A. P. Mathur. “WADI: A Water Distribution Testbed for</w:t>
       </w:r>
@@ -17311,7 +17299,7 @@
       <w:r>
         <w:t xml:space="preserve"> </w:t>
       </w:r>
-      <w:hyperlink r:id="rId63">
+      <w:hyperlink r:id="rId62">
         <w:r>
           <w:rPr>
             <w:rStyle w:val="Hyperlink"/>
@@ -17322,7 +17310,7 @@
       <w:r>
         <w:t xml:space="preserve">.</w:t>
       </w:r>
-      <w:bookmarkEnd w:id="64"/>
+      <w:bookmarkEnd w:id="63"/>
     </w:p>
     <w:p>
       <w:pPr>
@@ -17341,7 +17329,7 @@
         </w:rPr>
         <w:t xml:space="preserve">14. </w:t>
       </w:r>
-      <w:bookmarkStart w:id="66" w:name="r-hai"/>
+      <w:bookmarkStart w:id="65" w:name="r-hai"/>
       <w:r>
         <w:t xml:space="preserve">H.-K. Shin, W. Lee, J.-H. Yun, and H. Kim. “HAI 1.0: HIL-based Augmented ICS Security</w:t>
       </w:r>
@@ -17367,7 +17355,7 @@
       <w:r>
         <w:t xml:space="preserve"> </w:t>
       </w:r>
-      <w:hyperlink r:id="rId65">
+      <w:hyperlink r:id="rId64">
         <w:r>
           <w:rPr>
             <w:rStyle w:val="Hyperlink"/>
@@ -17378,7 +17366,7 @@
       <w:r>
         <w:t xml:space="preserve">.</w:t>
       </w:r>
-      <w:bookmarkEnd w:id="66"/>
+      <w:bookmarkEnd w:id="65"/>
     </w:p>
     <w:p>
       <w:pPr>
@@ -17397,7 +17385,7 @@
         </w:rPr>
         <w:t xml:space="preserve">15. </w:t>
       </w:r>
-      <w:bookmarkStart w:id="68" w:name="r-skab"/>
+      <w:bookmarkStart w:id="67" w:name="r-skab"/>
       <w:r>
         <w:t xml:space="preserve">I. D. Katser and V. O. Kozitsin. “Skoltech Anomaly Benchmark (SKAB).” Kaggle</w:t>
       </w:r>
@@ -17410,7 +17398,7 @@
       <w:r>
         <w:t xml:space="preserve"> </w:t>
       </w:r>
-      <w:hyperlink r:id="rId67">
+      <w:hyperlink r:id="rId66">
         <w:r>
           <w:rPr>
             <w:rStyle w:val="Hyperlink"/>
@@ -17421,7 +17409,7 @@
       <w:r>
         <w:t xml:space="preserve">.</w:t>
       </w:r>
-      <w:bookmarkEnd w:id="68"/>
+      <w:bookmarkEnd w:id="67"/>
     </w:p>
     <w:p>
       <w:pPr>
@@ -17440,14 +17428,14 @@
         </w:rPr>
         <w:t xml:space="preserve">16. </w:t>
       </w:r>
-      <w:bookmarkStart w:id="70" w:name="r-bouman"/>
+      <w:bookmarkStart w:id="69" w:name="r-bouman"/>
       <w:r>
         <w:t xml:space="preserve">R. Bouman and T. Heskes. “Autoencoders for Anomaly Detection are Unreliable.” arXiv preprint, 2025.</w:t>
       </w:r>
       <w:r>
         <w:t xml:space="preserve"> </w:t>
       </w:r>
-      <w:hyperlink r:id="rId69">
+      <w:hyperlink r:id="rId68">
         <w:r>
           <w:rPr>
             <w:rStyle w:val="Hyperlink"/>
@@ -17458,7 +17446,7 @@
       <w:r>
         <w:t xml:space="preserve">.</w:t>
       </w:r>
-      <w:bookmarkEnd w:id="70"/>
+      <w:bookmarkEnd w:id="69"/>
     </w:p>
     <w:p>
       <w:pPr>
@@ -17477,7 +17465,7 @@
         </w:rPr>
         <w:t xml:space="preserve">17. </w:t>
       </w:r>
-      <w:bookmarkStart w:id="72" w:name="r-memae"/>
+      <w:bookmarkStart w:id="71" w:name="r-memae"/>
       <w:r>
         <w:t xml:space="preserve">D. Gong, L. Liu, V. Le, B. Saha, M. R. Mansour, S. Venkatesh, and A. van den Hengel. “Memorizing Normality to Detect Anomaly: Memory-augmented Deep Autoencoder for Unsupervised Anomaly Detection.”</w:t>
       </w:r>
@@ -17497,7 +17485,7 @@
       <w:r>
         <w:t xml:space="preserve"> </w:t>
       </w:r>
-      <w:hyperlink r:id="rId71">
+      <w:hyperlink r:id="rId70">
         <w:r>
           <w:rPr>
             <w:rStyle w:val="Hyperlink"/>
@@ -17508,7 +17496,7 @@
       <w:r>
         <w:t xml:space="preserve">.</w:t>
       </w:r>
-      <w:bookmarkEnd w:id="72"/>
+      <w:bookmarkEnd w:id="71"/>
     </w:p>
     <w:p>
       <w:pPr>
@@ -17527,7 +17515,7 @@
         </w:rPr>
         <w:t xml:space="preserve">18. </w:t>
       </w:r>
-      <w:bookmarkStart w:id="74" w:name="r-sarfraz"/>
+      <w:bookmarkStart w:id="73" w:name="r-sarfraz"/>
       <w:r>
         <w:t xml:space="preserve">M. S. Sarfraz, M.-Y. Chen, L. Layer, K. Peng, and M. Koulakis. “Position: Quo Vadis, Unsupervised Time Series Anomaly Detection?”</w:t>
       </w:r>
@@ -17547,7 +17535,7 @@
       <w:r>
         <w:t xml:space="preserve"> </w:t>
       </w:r>
-      <w:hyperlink r:id="rId73">
+      <w:hyperlink r:id="rId72">
         <w:r>
           <w:rPr>
             <w:rStyle w:val="Hyperlink"/>
@@ -17558,7 +17546,7 @@
       <w:r>
         <w:t xml:space="preserve">.</w:t>
       </w:r>
-      <w:bookmarkEnd w:id="74"/>
+      <w:bookmarkEnd w:id="73"/>
     </w:p>
     <w:p>
       <w:pPr>
@@ -17577,7 +17565,7 @@
         </w:rPr>
         <w:t xml:space="preserve">19. </w:t>
       </w:r>
-      <w:bookmarkStart w:id="76" w:name="r-timesead"/>
+      <w:bookmarkStart w:id="75" w:name="r-timesead"/>
       <w:r>
         <w:t xml:space="preserve">D. Wagner, T. Michels, F. C. F. Schulz, A. Nair, M. Rudolph, and M. Kloft. “TimeSeAD: Benchmarking Deep Multivariate Time-Series Anomaly Detection.”</w:t>
       </w:r>
@@ -17597,7 +17585,7 @@
       <w:r>
         <w:t xml:space="preserve"> </w:t>
       </w:r>
-      <w:hyperlink r:id="rId75">
+      <w:hyperlink r:id="rId74">
         <w:r>
           <w:rPr>
             <w:rStyle w:val="Hyperlink"/>
@@ -17608,7 +17596,7 @@
       <w:r>
         <w:t xml:space="preserve">.</w:t>
       </w:r>
-      <w:bookmarkEnd w:id="76"/>
+      <w:bookmarkEnd w:id="75"/>
     </w:p>
     <w:p>
       <w:pPr>
@@ -17627,7 +17615,7 @@
         </w:rPr>
         <w:t xml:space="preserve">20. </w:t>
       </w:r>
-      <w:bookmarkStart w:id="78" w:name="r-swat"/>
+      <w:bookmarkStart w:id="77" w:name="r-swat"/>
       <w:r>
         <w:t xml:space="preserve">A. P. Mathur and N. O. Tippenhauer. “SWaT: A Water Treatment Testbed for Research and Training on ICS Security.”</w:t>
       </w:r>
@@ -17647,7 +17635,7 @@
       <w:r>
         <w:t xml:space="preserve"> </w:t>
       </w:r>
-      <w:hyperlink r:id="rId77">
+      <w:hyperlink r:id="rId76">
         <w:r>
           <w:rPr>
             <w:rStyle w:val="Hyperlink"/>
@@ -17658,7 +17646,7 @@
       <w:r>
         <w:t xml:space="preserve">.</w:t>
       </w:r>
-      <w:bookmarkEnd w:id="78"/>
+      <w:bookmarkEnd w:id="77"/>
     </w:p>
     <w:p>
       <w:pPr>
@@ -17677,7 +17665,7 @@
         </w:rPr>
         <w:t xml:space="preserve">21. </w:t>
       </w:r>
-      <w:bookmarkStart w:id="80" w:name="r-aead"/>
+      <w:bookmarkStart w:id="79" w:name="r-aead"/>
       <w:r>
         <w:t xml:space="preserve">M. Sakurada and T. Yairi. “Anomaly Detection Using Autoencoders with Nonlinear Dimensionality Reduction.”</w:t>
       </w:r>
@@ -17697,7 +17685,7 @@
       <w:r>
         <w:t xml:space="preserve"> </w:t>
       </w:r>
-      <w:hyperlink r:id="rId79">
+      <w:hyperlink r:id="rId78">
         <w:r>
           <w:rPr>
             <w:rStyle w:val="Hyperlink"/>
@@ -17708,7 +17696,7 @@
       <w:r>
         <w:t xml:space="preserve">.</w:t>
       </w:r>
-      <w:bookmarkEnd w:id="80"/>
+      <w:bookmarkEnd w:id="79"/>
     </w:p>
     <w:p>
       <w:pPr>
@@ -17727,7 +17715,7 @@
         </w:rPr>
         <w:t xml:space="preserve">22. </w:t>
       </w:r>
-      <w:bookmarkStart w:id="82" w:name="r-chandola"/>
+      <w:bookmarkStart w:id="81" w:name="r-chandola"/>
       <w:r>
         <w:t xml:space="preserve">V. Chandola, A. Banerjee, and V. Kumar. “Anomaly Detection: A Survey.”</w:t>
       </w:r>
@@ -17747,7 +17735,7 @@
       <w:r>
         <w:t xml:space="preserve"> </w:t>
       </w:r>
-      <w:hyperlink r:id="rId81">
+      <w:hyperlink r:id="rId80">
         <w:r>
           <w:rPr>
             <w:rStyle w:val="Hyperlink"/>
@@ -17758,7 +17746,7 @@
       <w:r>
         <w:t xml:space="preserve">.</w:t>
       </w:r>
-      <w:bookmarkEnd w:id="82"/>
+      <w:bookmarkEnd w:id="81"/>
     </w:p>
     <w:p>
       <w:pPr>
@@ -17777,7 +17765,7 @@
         </w:rPr>
         <w:t xml:space="preserve">23. </w:t>
       </w:r>
-      <w:bookmarkStart w:id="84" w:name="r-pang"/>
+      <w:bookmarkStart w:id="83" w:name="r-pang"/>
       <w:r>
         <w:t xml:space="preserve">G. Pang, C. Shen, L. Cao, and A. van den Hengel. “Deep Learning for Anomaly Detection: A Review.”</w:t>
       </w:r>
@@ -17797,7 +17785,7 @@
       <w:r>
         <w:t xml:space="preserve"> </w:t>
       </w:r>
-      <w:hyperlink r:id="rId83">
+      <w:hyperlink r:id="rId82">
         <w:r>
           <w:rPr>
             <w:rStyle w:val="Hyperlink"/>
@@ -17808,7 +17796,7 @@
       <w:r>
         <w:t xml:space="preserve">, doi:10.1145/3439950.</w:t>
       </w:r>
-      <w:bookmarkEnd w:id="84"/>
+      <w:bookmarkEnd w:id="83"/>
     </w:p>
     <w:p>
       <w:pPr>
@@ -17827,7 +17815,7 @@
         </w:rPr>
         <w:t xml:space="preserve">24. </w:t>
       </w:r>
-      <w:bookmarkStart w:id="86" w:name="r-ruff"/>
+      <w:bookmarkStart w:id="85" w:name="r-ruff"/>
       <w:r>
         <w:t xml:space="preserve">L. Ruff, J. R. Kauffmann, R. A. Vandermeulen, G. Montavon, W. Samek, M. Kloft, T. G. Dietterich, and K.-R. Müller. “A Unifying Review of Deep and Shallow Anomaly Detection.”</w:t>
       </w:r>
@@ -17847,7 +17835,7 @@
       <w:r>
         <w:t xml:space="preserve"> </w:t>
       </w:r>
-      <w:hyperlink r:id="rId85">
+      <w:hyperlink r:id="rId84">
         <w:r>
           <w:rPr>
             <w:rStyle w:val="Hyperlink"/>
@@ -17858,7 +17846,7 @@
       <w:r>
         <w:t xml:space="preserve">, doi:10.1109/JPROC.2021.3052449.</w:t>
       </w:r>
-      <w:bookmarkEnd w:id="86"/>
+      <w:bookmarkEnd w:id="85"/>
     </w:p>
     <w:p>
       <w:pPr>
@@ -17877,7 +17865,7 @@
         </w:rPr>
         <w:t xml:space="preserve">25. </w:t>
       </w:r>
-      <w:bookmarkStart w:id="88" w:name="r-tsreview"/>
+      <w:bookmarkStart w:id="87" w:name="r-tsreview"/>
       <w:r>
         <w:t xml:space="preserve">A. Blázquez-García, A. Conde, U. Mori, and J. A. Lozano. “A Review on Outlier/Anomaly Detection in Time Series Data.”</w:t>
       </w:r>
@@ -17897,7 +17885,7 @@
       <w:r>
         <w:t xml:space="preserve"> </w:t>
       </w:r>
-      <w:hyperlink r:id="rId87">
+      <w:hyperlink r:id="rId86">
         <w:r>
           <w:rPr>
             <w:rStyle w:val="Hyperlink"/>
@@ -17908,7 +17896,7 @@
       <w:r>
         <w:t xml:space="preserve">, doi:10.1145/3444690.</w:t>
       </w:r>
-      <w:bookmarkEnd w:id="88"/>
+      <w:bookmarkEnd w:id="87"/>
     </w:p>
     <w:p>
       <w:pPr>
@@ -17927,7 +17915,7 @@
         </w:rPr>
         <w:t xml:space="preserve">26. </w:t>
       </w:r>
-      <w:bookmarkStart w:id="90" w:name="r-icssurvey"/>
+      <w:bookmarkStart w:id="89" w:name="r-icssurvey"/>
       <w:r>
         <w:t xml:space="preserve">Y. Hu, A. Yang, H. Li, Y. Sun, and L. Sun. “A Survey of Intrusion Detection on Industrial Control Systems.”</w:t>
       </w:r>
@@ -17947,7 +17935,7 @@
       <w:r>
         <w:t xml:space="preserve"> </w:t>
       </w:r>
-      <w:hyperlink r:id="rId89">
+      <w:hyperlink r:id="rId88">
         <w:r>
           <w:rPr>
             <w:rStyle w:val="Hyperlink"/>
@@ -17958,10 +17946,10 @@
       <w:r>
         <w:t xml:space="preserve">.</w:t>
       </w:r>
-      <w:bookmarkEnd w:id="90"/>
+      <w:bookmarkEnd w:id="89"/>
     </w:p>
+    <w:bookmarkEnd w:id="90"/>
     <w:bookmarkEnd w:id="91"/>
-    <w:bookmarkEnd w:id="92"/>
     <w:sectPr>
       <w:footerReference w:type="default" r:id="rId9"/>
       <w:pgSz w:h="15840" w:w="12240"/>

</xml_diff>

<commit_message>
zenodo: wire DOI 10.5281/zenodo.21821524 into availability statement; rebuild DOCX
- Data Availability Statement now points to the live Zenodo record
- zenodo.json: drop invalid related_identifiers placeholder (caused a 400 on metadata PUT)
- publish_zenodo.py: add --deposition <id> to fix+publish an existing draft (keeps the reserved DOI stable)
- MDPI + generic DOCX rebuilt with the DOI (48 OMML eqs, figure)

Co-Authored-By: Claude Opus 4.8 <noreply@anthropic.com>
</commit_message>
<xml_diff>
--- a/poc/paper/paper.docx
+++ b/poc/paper/paper.docx
@@ -15838,7 +15838,7 @@
           <wp:inline>
             <wp:extent cx="5943600" cy="2476500"/>
             <wp:effectExtent b="0" l="0" r="0" t="0"/>
-            <wp:docPr descr="fig" title="" id="32" name="Picture"/>
+            <wp:docPr descr="Difficult-subset AUROC by method" title="" id="32" name="Picture"/>
             <a:graphic>
               <a:graphicData uri="http://schemas.openxmlformats.org/drawingml/2006/picture">
                 <pic:pic>
@@ -16589,7 +16589,7 @@
         <w:t xml:space="preserve"> </w:t>
       </w:r>
       <w:r>
-        <w:t xml:space="preserve">This study uses only publicly available community benchmark datasets and created no new data. WADI and SWaT are available from iTrust, Singapore University of Technology and Design (https://itrust.sutd.edu.sg/, access granted on request); HAI is available from its public release by ETRI; and SKAB is available from its public repository. The source code supporting the reported results is available from the corresponding author on reasonable request.</w:t>
+        <w:t xml:space="preserve">This study uses only publicly available community benchmark datasets and created no new data. WADI and SWaT are available from iTrust, Singapore University of Technology and Design (https://itrust.sutd.edu.sg/, access granted on request); HAI is available from its public release by ETRI; and SKAB is available from its public repository. The trained model checkpoints (one per dataset) and the source code supporting the reported results are openly archived on Zenodo at https://doi.org/10.5281/zenodo.21821524. Each checkpoint contains learned parameters only, not the underlying data, and is trained with a fixed seed so that it reproduces the reported numbers.</w:t>
       </w:r>
     </w:p>
     <w:p>

</xml_diff>

<commit_message>
paper(IoT): clearer abstract + full MDPI style compliance in DOCX
- Abstract rewritten in plainer language (short sentences, 'Two things make this hard: First/Second'); 225w
- MDPI DOCX now 100% MDPI-styled: body text MDPI_3.1/3.2 (was mis-mapped to 1.8_keywords),
  abstract MDPI_1.7, lists MDPI_3.8_bullet; NON-MDPI styles = none
- root index.html + paper_mdpi.docx resynced for Pages

Co-Authored-By: Claude Opus 4.8 <noreply@anthropic.com>
</commit_message>
<xml_diff>
--- a/poc/paper/paper.docx
+++ b/poc/paper/paper.docx
@@ -2,7 +2,7 @@
 <file path=word/document.xml><?xml version="1.0" encoding="utf-8"?>
 <w:document xmlns:w="http://schemas.openxmlformats.org/wordprocessingml/2006/main" xmlns:m="http://schemas.openxmlformats.org/officeDocument/2006/math" xmlns:r="http://schemas.openxmlformats.org/officeDocument/2006/relationships" xmlns:o="urn:schemas-microsoft-com:office:office" xmlns:v="urn:schemas-microsoft-com:vml" xmlns:w10="urn:schemas-microsoft-com:office:word" xmlns:a="http://schemas.openxmlformats.org/drawingml/2006/main" xmlns:pic="http://schemas.openxmlformats.org/drawingml/2006/picture" xmlns:wp="http://schemas.openxmlformats.org/drawingml/2006/wordprocessingDrawing">
   <w:body>
-    <w:bookmarkStart w:id="90" w:name="X82f8a503c88a86fef885ebbff7266bf4401a396"/>
+    <w:bookmarkStart w:id="90" w:name="X34ffeccd8fa8680466ef726aa48b22427e6bffb"/>
     <w:p>
       <w:pPr>
         <w:pStyle w:val="Title"/>
@@ -13,7 +13,7 @@
         <w:widowControl w:val="1"/>
       </w:pPr>
       <w:r>
-        <w:t xml:space="preserve">Modeling Normal Is All You Need: Joint Latent Clustering for Anomaly Detection in Multimodal Cyber-Physical Systems</w:t>
+        <w:t xml:space="preserve">Modeling Normal Is All You Need: Joint Latent Clustering for Anomaly Detection in Multimodal Cyber-Physical Systems and the Industrial IoT</w:t>
       </w:r>
     </w:p>
     <w:p>
@@ -186,23 +186,7 @@
         <w:widowControl w:val="1"/>
       </w:pPr>
       <w:r>
-        <w:t xml:space="preserve">Faults on a networked cyber-physical system (CPS), the sensing-and-actuation core of an industrial Internet-of-Things (IoT) deployment, are too rare and unrepresentative to characterise or to select a model on, so detection must instead</w:t>
-      </w:r>
-      <w:r>
-        <w:t xml:space="preserve"> </w:t>
-      </w:r>
-      <w:r>
-        <w:rPr>
-          <w:i/>
-          <w:iCs/>
-        </w:rPr>
-        <w:t xml:space="preserve">model normal</w:t>
-      </w:r>
-      <w:r>
-        <w:t xml:space="preserve"> </w:t>
-      </w:r>
-      <w:r>
-        <w:t xml:space="preserve">behaviour; the standard point-adjusted evaluation, however, rewards detectors that never do. CPS normal behaviour is the union of many imbalanced, curved, thin-fringed operating regimes rather than a single blob, a structure we state as ten assumptions (A1–A10) abbreviated</w:t>
+        <w:t xml:space="preserve">Networked cyber-physical systems (CPS), the sensing-and-actuation core of the industrial Internet of Things (IoT), must be monitored for faults. Because real faults are rare and never cover every way a system can fail, a detector cannot learn them directly; it must instead learn normal behaviour and flag departures from it. Two things make this hard. First, normal CPS behaviour is not a single cluster but a union of many operating regimes, some frequent and some rare, each with legitimate low-density edges; we state this as ten assumptions (A1–A10), abbreviated</w:t>
       </w:r>
       <w:r>
         <w:t xml:space="preserve"> </w:t>
@@ -218,7 +202,7 @@
         <w:t xml:space="preserve"> </w:t>
       </w:r>
       <w:r>
-        <w:t xml:space="preserve">(MIIM). We model the normal law with a jointly learned latent plus explicit Gaussian-mixture mode clustering, scored in the latent rather than by a global density or a reconstruction residual, and evaluate under a fair protocol: raw point-wise metrics, a trivial-detector difficulty split, prevalence-matched F1, and train-normal-only calibration. On three real CPS datasets (WADI, HAI, SKAB) the detector</w:t>
+        <w:t xml:space="preserve">(MIIM). Second, the point-adjusted scoring used in most papers is so lenient that even a random detector can top the rankings. Our method learns a latent space and an explicit Gaussian mixture of operating modes together, then scores each window by how well it fits those modes, dropping the reconstruction error that a flexible decoder makes uninformative. We evaluate it fairly, with raw point-wise metrics, a split into easy and difficult anomalies, prevalence-matched F1, and calibration on normal data only. On three real CPS datasets (WADI, HAI, SKAB) it gives</w:t>
       </w:r>
       <w:r>
         <w:t xml:space="preserve"> </w:t>
@@ -228,10 +212,13 @@
           <w:b/>
           <w:bCs/>
         </w:rPr>
-        <w:t xml:space="preserve">wins both the combined and the difficult column on all three</w:t>
-      </w:r>
-      <w:r>
-        <w:t xml:space="preserve">, reaching difficult-subset AUROC 0.831 on HAI, 0.726 on WADI and 0.610 on SKAB. The margin is largest on the two multimodal datasets the assumptions target and slimmest on the near-unimodal one, and it holds against three deep detectors (USAD, TranAD, GDN) re-scored with the same raw metrics. The contributions are the MIIM assumption set, the difficulty-stratified protocol, and a latent-only score that drops reconstruction because a flexible decoder rebuilds the hard faults faithfully.</w:t>
+        <w:t xml:space="preserve">the best overall and the best difficult-case detection on all three</w:t>
+      </w:r>
+      <w:r>
+        <w:t xml:space="preserve"> </w:t>
+      </w:r>
+      <w:r>
+        <w:t xml:space="preserve">(difficult-subset AUROC 0.831, 0.726 and 0.610), beating three deep detectors (USAD, TranAD, GDN) re-scored under the same metrics. The margin is largest on the most multimodal systems, exactly as MIIM predicts.</w:t>
       </w:r>
     </w:p>
     <w:bookmarkEnd w:id="9"/>

</xml_diff>

<commit_message>
paper(IoT): author-supplied abstract (railway ref dropped); abstract now MDPI_1.7 styled
- Replace abstract with author's version; drop the 'railway CPS' mismatch and redundant (CPS)
- MDPI DOCX: abstract body now MDPI_1.7_abstract (was 1.8_keywords); NON-MDPI styles = none
- resync root index.html + paper_mdpi.docx for Pages

Co-Authored-By: Claude Opus 4.8 <noreply@anthropic.com>
</commit_message>
<xml_diff>
--- a/poc/paper/paper.docx
+++ b/poc/paper/paper.docx
@@ -186,7 +186,7 @@
         <w:widowControl w:val="1"/>
       </w:pPr>
       <w:r>
-        <w:t xml:space="preserve">Networked cyber-physical systems (CPS), the sensing-and-actuation core of the industrial Internet of Things (IoT), must be monitored for faults. Because real faults are rare and never cover every way a system can fail, a detector cannot learn them directly; it must instead learn normal behaviour and flag departures from it. Two things make this hard. First, normal CPS behaviour is not a single cluster but a union of many operating regimes, some frequent and some rare, each with legitimate low-density edges; we state this as ten assumptions (A1–A10), abbreviated</w:t>
+        <w:t xml:space="preserve">Fault detection in networked cyber-physical systems (CPS), which form the sensing and actuation layer of industrial Internet-of-Things deployments, is difficult because faults are rare and poorly represented in available data. Detection must therefore rely on models of normal behaviour rather than representative fault examples. However, existing AI methods often fail because they ignore the unique structure of CPS, where stochastic behaviour is constrained by physical laws, engineered control logic, and numerous operating regimes. More generally, normal CPS behaviour is not a single distribution, but a union of many imbalanced, curved, and sparsely populated regimes. We formalize this structure through ten assumptions, A1–A10, summarized as</w:t>
       </w:r>
       <w:r>
         <w:t xml:space="preserve"> </w:t>
@@ -202,23 +202,7 @@
         <w:t xml:space="preserve"> </w:t>
       </w:r>
       <w:r>
-        <w:t xml:space="preserve">(MIIM). Second, the point-adjusted scoring used in most papers is so lenient that even a random detector can top the rankings. Our method learns a latent space and an explicit Gaussian mixture of operating modes together, then scores each window by how well it fits those modes, dropping the reconstruction error that a flexible decoder makes uninformative. We evaluate it fairly, with raw point-wise metrics, a split into easy and difficult anomalies, prevalence-matched F1, and calibration on normal data only. On three real CPS datasets (WADI, HAI, SKAB) it gives</w:t>
-      </w:r>
-      <w:r>
-        <w:t xml:space="preserve"> </w:t>
-      </w:r>
-      <w:r>
-        <w:rPr>
-          <w:b/>
-          <w:bCs/>
-        </w:rPr>
-        <w:t xml:space="preserve">the best overall and the best difficult-case detection on all three</w:t>
-      </w:r>
-      <w:r>
-        <w:t xml:space="preserve"> </w:t>
-      </w:r>
-      <w:r>
-        <w:t xml:space="preserve">(difficult-subset AUROC 0.831, 0.726 and 0.610), beating three deep detectors (USAD, TranAD, GDN) re-scored under the same metrics. The margin is largest on the most multimodal systems, exactly as MIIM predicts.</w:t>
+        <w:t xml:space="preserve">(MIIM). Based on these assumptions, we jointly learn a latent representation and a Gaussian-mixture clustering of operating modes. Anomaly scores are computed directly in latent space rather than from a density estimate or reconstruction error. We evaluate the method using raw point-wise metrics, a split between easy and difficult cases defined by a trivial detector, prevalence-matched F1, and calibration using normal training data. Across WADI, HAI, and SKAB, the method performs best overall and on difficult subsets, achieving AUROC values of 0.831, 0.726, and 0.610, respectively. Gains are strongest on multimodal datasets and remain consistent against USAD, TranAD, and GDN. The contributions are the MIIM assumptions, the difficulty-stratified protocol, and a latent-only anomaly score.</w:t>
       </w:r>
     </w:p>
     <w:bookmarkEnd w:id="9"/>

</xml_diff>

<commit_message>
paper(IoT): drop 'and the Industrial IoT' from title (HTML, template, both DOCX, Pages)
Title reverts to 'Modeling Normal Is All You Need: Joint Latent Clustering for Anomaly
Detection in Multimodal Cyber-Physical Systems'. IoT framing stays in abstract/body.
Rebuilt MDPI + generic DOCX; resynced root index.html + paper_mdpi.docx.

Co-Authored-By: Claude Opus 4.8 <noreply@anthropic.com>
</commit_message>
<xml_diff>
--- a/poc/paper/paper.docx
+++ b/poc/paper/paper.docx
@@ -2,7 +2,7 @@
 <file path=word/document.xml><?xml version="1.0" encoding="utf-8"?>
 <w:document xmlns:w="http://schemas.openxmlformats.org/wordprocessingml/2006/main" xmlns:m="http://schemas.openxmlformats.org/officeDocument/2006/math" xmlns:r="http://schemas.openxmlformats.org/officeDocument/2006/relationships" xmlns:o="urn:schemas-microsoft-com:office:office" xmlns:v="urn:schemas-microsoft-com:vml" xmlns:w10="urn:schemas-microsoft-com:office:word" xmlns:a="http://schemas.openxmlformats.org/drawingml/2006/main" xmlns:pic="http://schemas.openxmlformats.org/drawingml/2006/picture" xmlns:wp="http://schemas.openxmlformats.org/drawingml/2006/wordprocessingDrawing">
   <w:body>
-    <w:bookmarkStart w:id="90" w:name="X34ffeccd8fa8680466ef726aa48b22427e6bffb"/>
+    <w:bookmarkStart w:id="90" w:name="X82f8a503c88a86fef885ebbff7266bf4401a396"/>
     <w:p>
       <w:pPr>
         <w:pStyle w:val="Title"/>
@@ -13,7 +13,7 @@
         <w:widowControl w:val="1"/>
       </w:pPr>
       <w:r>
-        <w:t xml:space="preserve">Modeling Normal Is All You Need: Joint Latent Clustering for Anomaly Detection in Multimodal Cyber-Physical Systems and the Industrial IoT</w:t>
+        <w:t xml:space="preserve">Modeling Normal Is All You Need: Joint Latent Clustering for Anomaly Detection in Multimodal Cyber-Physical Systems</w:t>
       </w:r>
     </w:p>
     <w:p>

</xml_diff>